<commit_message>
add theme color changer
</commit_message>
<xml_diff>
--- a/Schedule/Schedule Manager_raw/output.docx
+++ b/Schedule/Schedule Manager_raw/output.docx
@@ -332,7 +332,7 @@
           <w:rFonts w:ascii="Arial" w:eastAsia="KaiTi" w:hAnsi="Arial" w:cs="Arial"/>
           <w:b/>
           <w:bCs/>
-          <w:color w:val="002060"/>
+          <w:color w:val="FF9300"/>
           <w:kern w:val="0"/>
           <w:sz w:val="28"/>
           <w:szCs w:val="28"/>
@@ -343,7 +343,7 @@
           <w:rFonts w:ascii="Arial" w:eastAsia="KaiTi" w:hAnsi="Arial" w:cs="Arial"/>
           <w:b/>
           <w:bCs/>
-          <w:color w:val="002060"/>
+          <w:color w:val="FF9300"/>
           <w:kern w:val="0"/>
           <w:sz w:val="28"/>
           <w:szCs w:val="28"/>
@@ -356,7 +356,7 @@
           <w:rFonts w:ascii="Arial" w:eastAsia="KaiTi" w:hAnsi="Arial" w:cs="Arial"/>
           <w:b/>
           <w:bCs/>
-          <w:color w:val="002060"/>
+          <w:color w:val="FF9300"/>
           <w:kern w:val="0"/>
           <w:sz w:val="28"/>
           <w:szCs w:val="28"/>
@@ -396,7 +396,7 @@
               <w:top w:val="nil"/>
               <w:bottom w:val="nil"/>
             </w:tcBorders>
-            <w:shd w:val="clear" w:color="auto" w:fill="002060"/>
+            <w:shd w:val="clear" w:color="auto" w:fill="FF9300"/>
             <w:vAlign w:val="center"/>
           </w:tcPr>
           <w:p>
@@ -725,7 +725,7 @@
               <w:top w:val="nil"/>
               <w:bottom w:val="nil"/>
             </w:tcBorders>
-            <w:shd w:val="clear" w:color="auto" w:fill="002060"/>
+            <w:shd w:val="clear" w:color="auto" w:fill="FF9300"/>
             <w:vAlign w:val="center"/>
           </w:tcPr>
           <w:p>
@@ -1423,7 +1423,7 @@
         <w:rPr>
           <w:rFonts w:ascii="Arial" w:eastAsia="KaiTi" w:hAnsi="Arial" w:cs="Arial"/>
           <w:b/>
-          <w:color w:val="002060"/>
+          <w:color w:val="FF9300"/>
           <w:kern w:val="0"/>
           <w:sz w:val="28"/>
           <w:szCs w:val="24"/>
@@ -1444,7 +1444,7 @@
         <w:rPr>
           <w:rFonts w:ascii="Arial" w:eastAsia="KaiTi" w:hAnsi="Arial" w:cs="Arial"/>
           <w:b/>
-          <w:color w:val="002060"/>
+          <w:color w:val="FF9300"/>
           <w:kern w:val="0"/>
           <w:sz w:val="28"/>
           <w:szCs w:val="24"/>
@@ -1503,7 +1503,7 @@
               <w:top w:val="nil"/>
               <w:bottom w:val="nil"/>
             </w:tcBorders>
-            <w:shd w:val="clear" w:color="auto" w:fill="002060"/>
+            <w:shd w:val="clear" w:color="auto" w:fill="FF9300"/>
             <w:vAlign w:val="center"/>
           </w:tcPr>
           <w:p>
@@ -1914,7 +1914,6 @@
         <w:tc>
           <w:tcPr>
             <w:tcW w:w="654" w:type="pct"/>
-            <w:vMerge w:val="restart"/>
             <w:tcBorders>
               <w:top w:val="single" w:sz="4" w:space="0" w:color="auto"/>
               <w:bottom w:val="single" w:sz="4" w:space="0" w:color="auto"/>
@@ -1987,7 +1986,6 @@
           <w:tcPr>
             <w:tcW w:w="554" w:type="pct"/>
             <w:gridSpan w:val="2"/>
-            <w:vMerge w:val="restart"/>
             <w:tcBorders>
               <w:top w:val="single" w:sz="4" w:space="0" w:color="auto"/>
               <w:bottom w:val="single" w:sz="4" w:space="0" w:color="auto"/>
@@ -2013,7 +2011,7 @@
                 <w:sz w:val="20"/>
                 <w:szCs w:val="20"/>
               </w:rPr>
-              <w:t xml:space="preserve">小组会</w:t>
+              <w:t xml:space="preserve">1对1</w:t>
               <w:br/>
               <w:t xml:space="preserve">线下会议</w:t>
               <w:br/>
@@ -2049,9 +2047,9 @@
                 <w:sz w:val="20"/>
                 <w:szCs w:val="20"/>
               </w:rPr>
-              <w:t xml:space="preserve">China AMC</w:t>
+              <w:t xml:space="preserve">Allianz GI</w:t>
               <w:br/>
-              <w:t xml:space="preserve">华夏基金</w:t>
+              <w:t xml:space="preserve">安联投资</w:t>
             </w:r>
           </w:p>
         </w:tc>
@@ -2083,7 +2081,7 @@
                 <w:sz w:val="20"/>
                 <w:szCs w:val="20"/>
               </w:rPr>
-              <w:t xml:space="preserve">中资长线</w:t>
+              <w:t xml:space="preserve">国际长线</w:t>
             </w:r>
           </w:p>
         </w:tc>
@@ -2115,14 +2113,33 @@
                 <w:sz w:val="20"/>
                 <w:szCs w:val="20"/>
               </w:rPr>
-              <w:t xml:space="preserve">Shawn Huang（基金经理）甘添（总裁）黄硕（基金经理）张钧（研究部主管）宋坤蓉（分析师）远景动力：范磊（基金经理）阿麦斯Aaron Song（ECM）</w:t>
+              <w:t xml:space="preserve">Alex Jiang（医药投资经理）</w:t>
+              <w:br/>
+              <w:t xml:space="preserve"/>
+              <w:br/>
+              <w:t xml:space="preserve">远景动力：</w:t>
+              <w:br/>
+              <w:t xml:space="preserve">Christina Chung（董事总经理、资深基金经理、大中华区负责人、大中华区首席基金经理）</w:t>
+              <w:br/>
+              <w:t xml:space="preserve">Shaopin Guan（股权市场负责人）</w:t>
+              <w:br/>
+              <w:t xml:space="preserve">Kevin You（基金经理）</w:t>
+              <w:br/>
+              <w:t xml:space="preserve">Catherine Chan（资深分析师：科技、新能源）</w:t>
+              <w:br/>
+              <w:t xml:space="preserve">Thomas Zhu（资深分析师：工业、ESG、汽车）</w:t>
+              <w:br/>
+              <w:t xml:space="preserve"/>
+              <w:br/>
+              <w:t xml:space="preserve">Terrence Liu</w:t>
+              <w:br/>
+              <w:t xml:space="preserve">（消费行业分析师）</w:t>
             </w:r>
           </w:p>
         </w:tc>
         <w:tc>
           <w:tcPr>
             <w:tcW w:w="969" w:type="pct"/>
-            <w:vMerge w:val="restart"/>
             <w:tcBorders>
               <w:top w:val="single" w:sz="4" w:space="0" w:color="auto"/>
               <w:bottom w:val="single" w:sz="4" w:space="0" w:color="auto"/>
@@ -2148,14 +2165,13 @@
                 <w:sz w:val="20"/>
                 <w:szCs w:val="20"/>
               </w:rPr>
-              <w:t xml:space="preserve">address1</w:t>
+              <w:t xml:space="preserve">金钟金钟道 88 号太古广场二座 32 楼</w:t>
             </w:r>
           </w:p>
         </w:tc>
         <w:tc>
           <w:tcPr>
             <w:tcW w:w="490" w:type="pct"/>
-            <w:vMerge w:val="restart"/>
             <w:tcBorders>
               <w:top w:val="single" w:sz="4" w:space="0" w:color="auto"/>
               <w:bottom w:val="single" w:sz="4" w:space="0" w:color="auto"/>
@@ -2184,159 +2200,6 @@
               <w:t xml:space="preserve">招证国际</w:t>
             </w:r>
           </w:p>
-        </w:tc>
-      </w:tr>
-      <w:tr>
-        <w:trPr>
-          <w:trHeight w:val="1835"/>
-          <w:tblHeader/>
-        </w:trPr>
-        <w:tc>
-          <w:tcPr>
-            <w:tcW w:w="654" w:type="pct"/>
-            <w:vMerge/>
-            <w:tcBorders>
-              <w:top w:val="single" w:sz="4" w:space="0" w:color="auto"/>
-              <w:bottom w:val="single" w:sz="4" w:space="0" w:color="auto"/>
-            </w:tcBorders>
-            <w:vAlign w:val="center"/>
-          </w:tcPr>
-          <w:p/>
-        </w:tc>
-        <w:tc>
-          <w:tcPr>
-            <w:tcW w:w="554" w:type="pct"/>
-            <w:gridSpan w:val="2"/>
-            <w:vMerge/>
-            <w:tcBorders>
-              <w:top w:val="single" w:sz="4" w:space="0" w:color="auto"/>
-              <w:bottom w:val="single" w:sz="4" w:space="0" w:color="auto"/>
-            </w:tcBorders>
-            <w:vAlign w:val="center"/>
-          </w:tcPr>
-          <w:p/>
-        </w:tc>
-        <w:tc>
-          <w:tcPr>
-            <w:tcW w:w="833" w:type="pct"/>
-            <w:tcBorders>
-              <w:top w:val="single" w:sz="4" w:space="0" w:color="auto"/>
-              <w:bottom w:val="single" w:sz="4" w:space="0" w:color="auto"/>
-            </w:tcBorders>
-            <w:vAlign w:val="center"/>
-          </w:tcPr>
-          <w:p>
-            <w:pPr>
-              <w:widowControl/>
-              <w:jc w:val="center"/>
-              <w:rPr>
-                <w:rFonts w:ascii="Arial" w:eastAsia="KaiTi" w:hAnsi="Arial" w:cs="Arial"/>
-                <w:kern w:val="0"/>
-                <w:sz w:val="20"/>
-                <w:szCs w:val="20"/>
-              </w:rPr>
-            </w:pPr>
-            <w:proofErr w:type="gramStart"/>
-            <w:r>
-              <w:rPr>
-                <w:rFonts w:ascii="Arial" w:eastAsia="KaiTi" w:hAnsi="Arial" w:cs="Arial"/>
-                <w:kern w:val="0"/>
-                <w:sz w:val="20"/>
-                <w:szCs w:val="20"/>
-              </w:rPr>
-              <w:t xml:space="preserve">China Orient</w:t>
-              <w:br/>
-              <w:t xml:space="preserve">中国东方</w:t>
-            </w:r>
-          </w:p>
-        </w:tc>
-        <w:tc>
-          <w:tcPr>
-            <w:tcW w:w="667" w:type="pct"/>
-            <w:tcBorders>
-              <w:top w:val="single" w:sz="4" w:space="0" w:color="auto"/>
-              <w:bottom w:val="single" w:sz="4" w:space="0" w:color="auto"/>
-            </w:tcBorders>
-            <w:vAlign w:val="center"/>
-          </w:tcPr>
-          <w:p>
-            <w:pPr>
-              <w:widowControl/>
-              <w:jc w:val="center"/>
-              <w:rPr>
-                <w:rFonts w:ascii="Arial" w:eastAsia="KaiTi" w:hAnsi="Arial" w:cs="Arial"/>
-                <w:kern w:val="0"/>
-                <w:sz w:val="20"/>
-                <w:szCs w:val="20"/>
-              </w:rPr>
-            </w:pPr>
-            <w:proofErr w:type="gramStart"/>
-            <w:r>
-              <w:rPr>
-                <w:rFonts w:ascii="Arial" w:eastAsia="KaiTi" w:hAnsi="Arial" w:cs="Arial"/>
-                <w:kern w:val="0"/>
-                <w:sz w:val="20"/>
-                <w:szCs w:val="20"/>
-              </w:rPr>
-              <w:t xml:space="preserve">中资长线</w:t>
-            </w:r>
-          </w:p>
-        </w:tc>
-        <w:tc>
-          <w:tcPr>
-            <w:tcW w:w="833" w:type="pct"/>
-            <w:tcBorders>
-              <w:top w:val="single" w:sz="4" w:space="0" w:color="auto"/>
-              <w:bottom w:val="single" w:sz="4" w:space="0" w:color="auto"/>
-            </w:tcBorders>
-            <w:vAlign w:val="center"/>
-          </w:tcPr>
-          <w:p>
-            <w:pPr>
-              <w:widowControl/>
-              <w:jc w:val="center"/>
-              <w:rPr>
-                <w:rFonts w:ascii="Arial" w:eastAsia="KaiTi" w:hAnsi="Arial" w:cs="Arial"/>
-                <w:kern w:val="0"/>
-                <w:sz w:val="20"/>
-                <w:szCs w:val="20"/>
-              </w:rPr>
-            </w:pPr>
-            <w:proofErr w:type="gramStart"/>
-            <w:r>
-              <w:rPr>
-                <w:rFonts w:ascii="Arial" w:eastAsia="KaiTi" w:hAnsi="Arial" w:cs="Arial"/>
-                <w:kern w:val="0"/>
-                <w:sz w:val="20"/>
-                <w:szCs w:val="20"/>
-              </w:rPr>
-              <w:t xml:space="preserve">张峰 （基金经理）</w:t>
-            </w:r>
-          </w:p>
-        </w:tc>
-        <w:tc>
-          <w:tcPr>
-            <w:tcW w:w="969" w:type="pct"/>
-            <w:vMerge/>
-            <w:tcBorders>
-              <w:top w:val="single" w:sz="4" w:space="0" w:color="auto"/>
-              <w:bottom w:val="single" w:sz="4" w:space="0" w:color="auto"/>
-            </w:tcBorders>
-            <w:vAlign w:val="center"/>
-          </w:tcPr>
-          <w:p/>
-        </w:tc>
-        <w:tc>
-          <w:tcPr>
-            <w:tcW w:w="490" w:type="pct"/>
-            <w:vMerge/>
-            <w:tcBorders>
-              <w:top w:val="single" w:sz="4" w:space="0" w:color="auto"/>
-              <w:bottom w:val="single" w:sz="4" w:space="0" w:color="auto"/>
-            </w:tcBorders>
-            <w:vAlign w:val="center"/>
-          </w:tcPr>
-          <w:p/>
         </w:tc>
       </w:tr>
       <w:tr>
@@ -2830,7 +2693,7 @@
         <w:rPr>
           <w:rFonts w:ascii="Arial" w:eastAsia="KaiTi" w:hAnsi="Arial" w:cs="Arial"/>
           <w:b/>
-          <w:color w:val="002060"/>
+          <w:color w:val="FF9300"/>
           <w:kern w:val="0"/>
           <w:sz w:val="28"/>
           <w:szCs w:val="24"/>
@@ -2889,7 +2752,7 @@
               <w:top w:val="nil"/>
               <w:bottom w:val="nil"/>
             </w:tcBorders>
-            <w:shd w:val="clear" w:color="auto" w:fill="002060"/>
+            <w:shd w:val="clear" w:color="auto" w:fill="FF9300"/>
             <w:vAlign w:val="center"/>
           </w:tcPr>
           <w:p>
@@ -4692,7 +4555,7 @@
         <w:rPr>
           <w:rFonts w:ascii="Arial" w:eastAsia="KaiTi" w:hAnsi="Arial" w:cs="Arial"/>
           <w:b/>
-          <w:color w:val="002060"/>
+          <w:color w:val="FF9300"/>
           <w:kern w:val="0"/>
           <w:sz w:val="28"/>
           <w:szCs w:val="24"/>
@@ -4751,7 +4614,7 @@
               <w:top w:val="nil"/>
               <w:bottom w:val="nil"/>
             </w:tcBorders>
-            <w:shd w:val="clear" w:color="auto" w:fill="002060"/>
+            <w:shd w:val="clear" w:color="auto" w:fill="FF9300"/>
             <w:vAlign w:val="center"/>
           </w:tcPr>
           <w:p>
@@ -5488,7 +5351,7 @@
         <w:rPr>
           <w:rFonts w:ascii="Arial" w:eastAsia="KaiTi" w:hAnsi="Arial" w:cs="Arial"/>
           <w:b/>
-          <w:color w:val="002060"/>
+          <w:color w:val="FF9300"/>
           <w:kern w:val="0"/>
           <w:sz w:val="28"/>
           <w:szCs w:val="24"/>
@@ -5508,7 +5371,7 @@
         <w:rPr>
           <w:rFonts w:ascii="Arial" w:eastAsia="KaiTi" w:hAnsi="Arial" w:cs="Arial"/>
           <w:b/>
-          <w:color w:val="002060"/>
+          <w:color w:val="FF9300"/>
           <w:kern w:val="0"/>
           <w:sz w:val="28"/>
           <w:szCs w:val="24"/>
@@ -5542,7 +5405,7 @@
           <w:tcPr>
             <w:tcW w:w="10912" w:type="dxa"/>
             <w:gridSpan w:val="2"/>
-            <w:shd w:val="clear" w:color="auto" w:fill="002060"/>
+            <w:shd w:val="clear" w:color="auto" w:fill="FF9300"/>
             <w:vAlign w:val="center"/>
           </w:tcPr>
           <w:p>
@@ -5718,9 +5581,9 @@
                 <w:sz w:val="20"/>
                 <w:szCs w:val="20"/>
               </w:rPr>
-              <w:t xml:space="preserve">China AMC</w:t>
+              <w:t xml:space="preserve">Allianz GI</w:t>
               <w:br/>
-              <w:t xml:space="preserve">华夏基金</w:t>
+              <w:t xml:space="preserve">安联投资</w:t>
             </w:r>
           </w:p>
           <w:p>
@@ -5857,7 +5720,7 @@
                 <w:sz w:val="20"/>
                 <w:szCs w:val="20"/>
               </w:rPr>
-              <w:t xml:space="preserve">小组会</w:t>
+              <w:t xml:space="preserve">1x1</w:t>
             </w:r>
           </w:p>
           <w:p>
@@ -5947,7 +5810,7 @@
                 <w:sz w:val="20"/>
                 <w:szCs w:val="20"/>
               </w:rPr>
-              <w:t xml:space="preserve">中资长线</w:t>
+              <w:t xml:space="preserve">国际长线</w:t>
             </w:r>
           </w:p>
           <w:p>
@@ -5986,7 +5849,7 @@
                 <w:sz w:val="20"/>
                 <w:szCs w:val="20"/>
               </w:rPr>
-              <w:t xml:space="preserve">超2.81万亿人民币</w:t>
+              <w:t xml:space="preserve">5,910亿欧元</w:t>
             </w:r>
           </w:p>
           <w:p>
@@ -6025,7 +5888,27 @@
                 <w:sz w:val="20"/>
                 <w:szCs w:val="20"/>
               </w:rPr>
-              <w:t xml:space="preserve">Shawn Huang（基金经理）甘添（总裁）黄硕（基金经理）张钧（研究部主管）宋坤蓉（分析师）远景动力：范磊（基金经理）阿麦斯Aaron Song（ECM）</w:t>
+              <w:t xml:space="preserve">Alex Jiang（医药投资经理）</w:t>
+              <w:br/>
+              <w:t xml:space="preserve"/>
+              <w:br/>
+              <w:t xml:space="preserve">远景动力：</w:t>
+              <w:br/>
+              <w:t xml:space="preserve">Christina Chung（董事总经理、资深基金经理、大中华区负责人、大中华区首席基金经理）</w:t>
+              <w:br/>
+              <w:t xml:space="preserve">Shaopin Guan（股权市场负责人）</w:t>
+              <w:br/>
+              <w:t xml:space="preserve">Kevin You（基金经理）</w:t>
+              <w:br/>
+              <w:t xml:space="preserve">Catherine Chan（资深分析师：科技、新能源）</w:t>
+              <w:br/>
+              <w:t xml:space="preserve">Thomas Zhu（资深分析师：工业、ESG、汽车）</w:t>
+              <w:br/>
+              <w:t xml:space="preserve"/>
+              <w:br/>
+              <w:t xml:space="preserve">Terrence Liu</w:t>
+              <w:br/>
+              <w:t xml:space="preserve">（消费行业分析师）</w:t>
             </w:r>
           </w:p>
           <w:p>
@@ -6124,7 +6007,7 @@
                 <w:sz w:val="20"/>
                 <w:szCs w:val="20"/>
               </w:rPr>
-              <w:t xml:space="preserve">华夏基金（China AMC）成立于1998年4月9日，是境内最早成立的公募基金管理人之一，拥有丰富的资产管理经验，管理规模持续行业领先。公司定位于综合型、全能化资产管理公司，服务范围覆盖多个资产类别、行业和地区，构建了以公募基金和机构业务为核心，涵盖华夏基金（香港）、华夏资本和华夏财富三家子公司的多元化资产管理平台。2025年1季度末，华夏基金管理资产规模超2.81万亿人民币，是境内最大的基金管理公司之一。</w:t>
+              <w:t xml:space="preserve">安联投资（Allianz Global Investors）是一家全球领先的主动资产管理机构。投资策略上，公司以主动管理为核心，覆盖股票、固定收益、多资产及私募市场等策略，并依托全球研究平台为机构及零售客户提供投资解决方案。偏好领域主要包括公开市场股票和债券、多资产配置及私募市场相关机会。投资者类型属于外资长线。截止到2025年12月31日，管理资产规模为5,910亿欧元。</w:t>
             </w:r>
             <w:r>
               <w:rPr>
@@ -6172,7 +6055,7 @@
                 <w:sz w:val="20"/>
                 <w:szCs w:val="20"/>
               </w:rPr>
-              <w:t xml:space="preserve">剂泰科技-P、长光辰芯、金浔资源、瑞博生物-B、精锋医疗-B、天数智芯、英矽智能、乐舒适、Fortior、圣贝拉、IMAX China、心通医疗-B等</w:t>
+              <w:t xml:space="preserve">大行科工</w:t>
             </w:r>
             <w:r>
               <w:rPr>
@@ -6236,9 +6119,9 @@
                 <w:sz w:val="20"/>
                 <w:szCs w:val="20"/>
               </w:rPr>
-              <w:t xml:space="preserve">China Orient</w:t>
+              <w:t xml:space="preserve">China Life PE</w:t>
               <w:br/>
-              <w:t xml:space="preserve">中国东方</w:t>
+              <w:t xml:space="preserve">国寿股权</w:t>
             </w:r>
           </w:p>
           <w:p>
@@ -6313,7 +6196,7 @@
                 <w:sz w:val="20"/>
                 <w:szCs w:val="20"/>
               </w:rPr>
-              <w:t xml:space="preserve">9:30-10:30</w:t>
+              <w:t xml:space="preserve">11:00-12:00</w:t>
             </w:r>
           </w:p>
           <w:p>
@@ -6465,7 +6348,7 @@
                 <w:sz w:val="20"/>
                 <w:szCs w:val="20"/>
               </w:rPr>
-              <w:t xml:space="preserve">中资长线</w:t>
+              <w:t xml:space="preserve"> 私募股权</w:t>
             </w:r>
           </w:p>
           <w:p>
@@ -6504,7 +6387,7 @@
                 <w:sz w:val="20"/>
                 <w:szCs w:val="20"/>
               </w:rPr>
-              <w:t xml:space="preserve"/>
+              <w:t xml:space="preserve">1.4万亿人民币</w:t>
             </w:r>
           </w:p>
           <w:p>
@@ -6543,7 +6426,7 @@
                 <w:sz w:val="20"/>
                 <w:szCs w:val="20"/>
               </w:rPr>
-              <w:t xml:space="preserve">张峰 （基金经理）</w:t>
+              <w:t xml:space="preserve">郑海军（投资总监）</w:t>
             </w:r>
           </w:p>
           <w:p>
@@ -6642,7 +6525,7 @@
                 <w:sz w:val="20"/>
                 <w:szCs w:val="20"/>
               </w:rPr>
-              <w:t xml:space="preserve">中国东方（China Orient）成立于1999年10月，是财政部直属的国有金融资产管理公司。公司以“化解金融风险、服务实体经济、助推国企改革”为核心使命，专注于特殊机遇资产投资、价值修复与重组重整。依托国家股东背景及专业优势，中国东方深耕不良资产经营主业，并积极拓展债转股、市场化债转股资产处置、企业重组及股权投资等业务，致力于通过长期价值挖掘赋能企业重生与产业升级。其投资活动广泛涉及国民经济重要领域，尤其在金融、地产、能源、制造业等国企改制相关领域拥有丰富经验。截至2024年末，公司管理资产规模达人民币13,186亿元。</w:t>
+              <w:t xml:space="preserve">国寿股权（China Life PE）成立于2016年6月，注册在上海自贸区，是中国人寿旗下的专业化私募股权投资平台，致力于发挥中国人寿的资源优势，做长期的价值投资者和共享共赢的合作伙伴。公司于2016年发起国内领先的旗舰型医疗健康产业投资基金—国寿大健康基金。国寿大健康基金也是保监会相关政策颁布后首支获批成立的保险资金私募股权投资基金。</w:t>
             </w:r>
             <w:r>
               <w:rPr>
@@ -6690,7 +6573,7 @@
                 <w:sz w:val="20"/>
                 <w:szCs w:val="20"/>
               </w:rPr>
-              <w:t xml:space="preserve">商米科技-W、长光辰芯、天数智芯、卧安机器人、顺丰房托、医渡科技、金科服务、中国科培、绿城服务、成实外教育</w:t>
+              <w:t xml:space="preserve">申万宏源</w:t>
             </w:r>
             <w:r>
               <w:rPr>
@@ -6754,9 +6637,9 @@
                 <w:sz w:val="20"/>
                 <w:szCs w:val="20"/>
               </w:rPr>
-              <w:t xml:space="preserve">China Life PE</w:t>
+              <w:t xml:space="preserve">CPIC</w:t>
               <w:br/>
-              <w:t xml:space="preserve">国寿股权</w:t>
+              <w:t xml:space="preserve">中国太保</w:t>
             </w:r>
           </w:p>
           <w:p>
@@ -6983,7 +6866,7 @@
                 <w:sz w:val="20"/>
                 <w:szCs w:val="20"/>
               </w:rPr>
-              <w:t xml:space="preserve"> 私募股权</w:t>
+              <w:t xml:space="preserve">险资长线</w:t>
             </w:r>
           </w:p>
           <w:p>
@@ -7022,7 +6905,7 @@
                 <w:sz w:val="20"/>
                 <w:szCs w:val="20"/>
               </w:rPr>
-              <w:t xml:space="preserve">1.4万亿人民币</w:t>
+              <w:t xml:space="preserve">3.26万亿人民币</w:t>
             </w:r>
           </w:p>
           <w:p>
@@ -7061,7 +6944,13 @@
                 <w:sz w:val="20"/>
                 <w:szCs w:val="20"/>
               </w:rPr>
-              <w:t xml:space="preserve">郑海军（投资总监）</w:t>
+              <w:t xml:space="preserve">Nick Feng（机械分析师）</w:t>
+              <w:br/>
+              <w:t xml:space="preserve">阿麦斯：</w:t>
+              <w:br/>
+              <w:t xml:space="preserve">Daniel Wu（董事）</w:t>
+              <w:br/>
+              <w:t xml:space="preserve">Alan Zhong（权益部负责人）</w:t>
             </w:r>
           </w:p>
           <w:p>
@@ -7160,7 +7049,7 @@
                 <w:sz w:val="20"/>
                 <w:szCs w:val="20"/>
               </w:rPr>
-              <w:t xml:space="preserve">国寿股权（China Life PE）成立于2016年6月，注册在上海自贸区，是中国人寿旗下的专业化私募股权投资平台，致力于发挥中国人寿的资源优势，做长期的价值投资者和共享共赢的合作伙伴。公司于2016年发起国内领先的旗舰型医疗健康产业投资基金—国寿大健康基金。国寿大健康基金也是保监会相关政策颁布后首支获批成立的保险资金私募股权投资基金。</w:t>
+              <w:t xml:space="preserve">中国太保（CPIC）成立于1991年5月13日，公司以全球视角，发挥险资大类资产配置基因，围绕固收、权益、另类投资三大支柱领域搭建投资策略，致力于与寻求最佳投资方案的客户并肩合作，打造专业化的金融投资产管理平台。近期港股基石投资案例包括顺丰控股、宁德时代、云想科技、嘉和生物-B等截止2024年6月，其资产管理规模为3.26 万亿人民币</w:t>
             </w:r>
             <w:r>
               <w:rPr>
@@ -7208,7 +7097,7 @@
                 <w:sz w:val="20"/>
                 <w:szCs w:val="20"/>
               </w:rPr>
-              <w:t xml:space="preserve">申万宏源</w:t>
+              <w:t xml:space="preserve">思格新能、创新实业、广和通、紫金黄金国际、宁德时代、EDA集团控股、天齐锂业</w:t>
             </w:r>
             <w:r>
               <w:rPr>
@@ -7264,7 +7153,7 @@
         <w:rPr>
           <w:rFonts w:ascii="Arial" w:eastAsia="KaiTi" w:hAnsi="Arial" w:cs="Arial"/>
           <w:b/>
-          <w:color w:val="002060"/>
+          <w:color w:val="FF9300"/>
           <w:kern w:val="0"/>
           <w:sz w:val="28"/>
           <w:szCs w:val="24"/>
@@ -7298,7 +7187,7 @@
           <w:tcPr>
             <w:tcW w:w="10912" w:type="dxa"/>
             <w:gridSpan w:val="2"/>
-            <w:shd w:val="clear" w:color="auto" w:fill="002060"/>
+            <w:shd w:val="clear" w:color="auto" w:fill="FF9300"/>
             <w:vAlign w:val="center"/>
           </w:tcPr>
           <w:p>
@@ -7325,7 +7214,7 @@
                 <w:sz w:val="24"/>
                 <w:szCs w:val="24"/>
               </w:rPr>
-              <w:t xml:space="preserve">6月18日（周四）</w:t>
+              <w:t xml:space="preserve">6月20日（周六）</w:t>
             </w:r>
             <w:r>
               <w:rPr>
@@ -7346,7 +7235,7 @@
                 <w:sz w:val="24"/>
                 <w:szCs w:val="24"/>
               </w:rPr>
-              <w:t xml:space="preserve">香港</w:t>
+              <w:t xml:space="preserve">上海</w:t>
             </w:r>
           </w:p>
         </w:tc>
@@ -7474,9 +7363,9 @@
                 <w:sz w:val="20"/>
                 <w:szCs w:val="20"/>
               </w:rPr>
-              <w:t xml:space="preserve">CPIC</w:t>
+              <w:t xml:space="preserve">GBA</w:t>
               <w:br/>
-              <w:t xml:space="preserve">中国太保</w:t>
+              <w:t xml:space="preserve">大湾区基金</w:t>
             </w:r>
           </w:p>
           <w:p>
@@ -7551,7 +7440,7 @@
                 <w:sz w:val="20"/>
                 <w:szCs w:val="20"/>
               </w:rPr>
-              <w:t xml:space="preserve">11:00-12:00</w:t>
+              <w:t xml:space="preserve">9:30-10:30</w:t>
             </w:r>
           </w:p>
           <w:p>
@@ -7703,7 +7592,7 @@
                 <w:sz w:val="20"/>
                 <w:szCs w:val="20"/>
               </w:rPr>
-              <w:t xml:space="preserve">险资长线</w:t>
+              <w:t xml:space="preserve">中资长线</w:t>
             </w:r>
           </w:p>
           <w:p>
@@ -7742,7 +7631,7 @@
                 <w:sz w:val="20"/>
                 <w:szCs w:val="20"/>
               </w:rPr>
-              <w:t xml:space="preserve">3.26万亿人民币</w:t>
+              <w:t xml:space="preserve">约600亿港元</w:t>
             </w:r>
           </w:p>
           <w:p>
@@ -7781,13 +7670,33 @@
                 <w:sz w:val="20"/>
                 <w:szCs w:val="20"/>
               </w:rPr>
-              <w:t xml:space="preserve">Nick Feng（机械分析师）</w:t>
+              <w:t xml:space="preserve">Adonis Zhu（董事总经理）</w:t>
               <w:br/>
-              <w:t xml:space="preserve">阿麦斯：</w:t>
+              <w:t xml:space="preserve">LUO Cheng, Adonis ZHU（执行董事）</w:t>
               <w:br/>
-              <w:t xml:space="preserve">Daniel Wu（董事）</w:t>
+              <w:t xml:space="preserve">Yolanda Yin（资深分析师）</w:t>
               <w:br/>
-              <w:t xml:space="preserve">Alan Zhong（权益部负责人）</w:t>
+              <w:t xml:space="preserve">张琼（资深分析师）</w:t>
+              <w:br/>
+              <w:t xml:space="preserve">Zena Zhang（资深分析师）</w:t>
+              <w:br/>
+              <w:t xml:space="preserve"/>
+              <w:br/>
+              <w:t xml:space="preserve">远景动力：</w:t>
+              <w:br/>
+              <w:t xml:space="preserve">胡章宏（董事长）</w:t>
+              <w:br/>
+              <w:t xml:space="preserve">殷聰（总经理）</w:t>
+              <w:br/>
+              <w:t xml:space="preserve">祝昱华（董事总经理）</w:t>
+              <w:br/>
+              <w:t xml:space="preserve">王建平（董事总经理）</w:t>
+              <w:br/>
+              <w:t xml:space="preserve">黄炜（执行总监）"</w:t>
+              <w:br/>
+              <w:t xml:space="preserve"/>
+              <w:br/>
+              <w:t xml:space="preserve">阿麦斯：Icey Tao（资深研究员）</w:t>
             </w:r>
           </w:p>
           <w:p>
@@ -7886,7 +7795,7 @@
                 <w:sz w:val="20"/>
                 <w:szCs w:val="20"/>
               </w:rPr>
-              <w:t xml:space="preserve">中国太保（CPIC）成立于1991年5月13日，公司以全球视角，发挥险资大类资产配置基因，围绕固收、权益、另类投资三大支柱领域搭建投资策略，致力于与寻求最佳投资方案的客户并肩合作，打造专业化的金融投资产管理平台。近期港股基石投资案例包括顺丰控股、宁德时代、云想科技、嘉和生物-B等截止2024年6月，其资产管理规模为3.26 万亿人民币</w:t>
+              <w:t xml:space="preserve">大湾区基金（GBA Homeland Development Fund）由国际大型产业机构、金融机构以及新经济企业联合发起成立，旗下设立大湾区共同家园发展基金，旨在把握粤港澳大湾区发展、国际科创中心建设等历史机遇，聚焦科技创新、产业升级、美好生活、智慧城市等相关领域，覆盖风险投资、私募股权投资、上市公司投资、并购投资等项目全生命周期，为优秀的创业者和企业提供资金支持、对接产业和金融资源，为股东和投资者实现长期回报，为经济和社会发展贡献积极力量。资产管理规模约600亿港元。</w:t>
             </w:r>
             <w:r>
               <w:rPr>
@@ -7934,7 +7843,1049 @@
                 <w:sz w:val="20"/>
                 <w:szCs w:val="20"/>
               </w:rPr>
-              <w:t xml:space="preserve">思格新能、创新实业、广和通、紫金黄金国际、宁德时代、EDA集团控股、天齐锂业</w:t>
+              <w:t xml:space="preserve">广合科技、精锋医疗-B、智汇矿业、紫金黄金国际、大行科工、FORITOR、蓝思科技、IFBH、三花智控、毛戈平、蓝月亮集团、正荣服务、永泰生物-B等</w:t>
+            </w:r>
+            <w:r>
+              <w:rPr>
+                <w:rFonts w:ascii="Arial" w:eastAsia="KaiTi" w:hAnsi="Arial" w:cs="Arial"/>
+                <w:kern w:val="0"/>
+                <w:sz w:val="20"/>
+                <w:szCs w:val="20"/>
+              </w:rPr>
+              <w:t>等</w:t>
+            </w:r>
+            <w:r>
+              <w:rPr>
+                <w:rFonts w:ascii="Arial" w:eastAsia="KaiTi" w:hAnsi="Arial" w:cs="Arial"/>
+                <w:kern w:val="0"/>
+                <w:sz w:val="20"/>
+                <w:szCs w:val="20"/>
+              </w:rPr>
+              <w:t xml:space="preserve"/>
+            </w:r>
+          </w:p>
+        </w:tc>
+      </w:tr>
+      <w:tr>
+        <w:trPr>
+          <w:jc w:val="center"/>
+        </w:trPr>
+        <w:tc>
+          <w:tcPr>
+            <w:tcW w:w="2327" w:type="dxa"/>
+            <w:tcBorders>
+              <w:top w:val="single" w:sz="4" w:space="0" w:color="auto"/>
+              <w:left w:val="nil"/>
+              <w:bottom w:val="single" w:sz="4" w:space="0" w:color="auto"/>
+              <w:right w:val="nil"/>
+            </w:tcBorders>
+          </w:tcPr>
+          <w:p>
+            <w:pPr>
+              <w:widowControl/>
+              <w:jc w:val="left"/>
+              <w:rPr>
+                <w:rFonts w:ascii="Arial" w:eastAsia="KaiTi" w:hAnsi="Arial" w:cs="Arial"/>
+                <w:sz w:val="20"/>
+                <w:szCs w:val="20"/>
+              </w:rPr>
+            </w:pPr>
+            <w:r>
+              <w:rPr>
+                <w:rFonts w:ascii="Arial" w:eastAsia="KaiTi" w:hAnsi="Arial" w:cs="Arial"/>
+                <w:sz w:val="20"/>
+                <w:szCs w:val="20"/>
+              </w:rPr>
+              <w:t xml:space="preserve"/>
+            </w:r>
+            <w:r>
+              <w:rPr>
+                <w:rFonts w:ascii="Arial" w:eastAsia="KaiTi" w:hAnsi="Arial" w:cs="Arial"/>
+                <w:b/>
+                <w:color w:val="000000"/>
+                <w:kern w:val="0"/>
+                <w:sz w:val="20"/>
+                <w:szCs w:val="20"/>
+              </w:rPr>
+              <w:t xml:space="preserve">SoftBank Venture Asia</w:t>
+              <w:br/>
+              <w:t xml:space="preserve">软银亚洲</w:t>
+            </w:r>
+          </w:p>
+          <w:p>
+            <w:pPr>
+              <w:widowControl/>
+              <w:snapToGrid w:val="0"/>
+              <w:spacing w:line="276" w:lineRule="auto"/>
+              <w:jc w:val="left"/>
+              <w:rPr>
+                <w:rFonts w:ascii="Arial" w:eastAsia="KaiTi" w:hAnsi="Arial" w:cs="Arial"/>
+                <w:b/>
+                <w:bCs/>
+                <w:kern w:val="0"/>
+                <w:sz w:val="20"/>
+                <w:szCs w:val="20"/>
+              </w:rPr>
+            </w:pPr>
+          </w:p>
+          <w:p>
+            <w:pPr>
+              <w:widowControl/>
+              <w:snapToGrid w:val="0"/>
+              <w:spacing w:line="276" w:lineRule="auto"/>
+              <w:jc w:val="left"/>
+              <w:rPr>
+                <w:rFonts w:ascii="Arial" w:eastAsia="KaiTi" w:hAnsi="Arial" w:cs="Arial"/>
+                <w:b/>
+                <w:kern w:val="0"/>
+                <w:sz w:val="20"/>
+                <w:szCs w:val="20"/>
+              </w:rPr>
+            </w:pPr>
+            <w:r>
+              <w:rPr>
+                <w:rFonts w:ascii="Arial" w:eastAsia="KaiTi" w:hAnsi="Arial" w:cs="Arial"/>
+                <w:b/>
+                <w:kern w:val="0"/>
+                <w:sz w:val="20"/>
+                <w:szCs w:val="20"/>
+              </w:rPr>
+              <w:t>会议时间</w:t>
+            </w:r>
+            <w:r>
+              <w:rPr>
+                <w:rFonts w:ascii="Arial" w:eastAsia="KaiTi" w:hAnsi="Arial" w:cs="Arial"/>
+                <w:b/>
+                <w:kern w:val="0"/>
+                <w:sz w:val="20"/>
+                <w:szCs w:val="20"/>
+              </w:rPr>
+              <w:t xml:space="preserve">:</w:t>
+            </w:r>
+          </w:p>
+          <w:p>
+            <w:pPr>
+              <w:widowControl/>
+              <w:snapToGrid w:val="0"/>
+              <w:spacing w:line="276" w:lineRule="auto"/>
+              <w:jc w:val="left"/>
+              <w:rPr>
+                <w:rFonts w:ascii="Arial" w:eastAsia="KaiTi" w:hAnsi="Arial" w:cs="Arial"/>
+                <w:kern w:val="0"/>
+                <w:sz w:val="20"/>
+                <w:szCs w:val="20"/>
+              </w:rPr>
+            </w:pPr>
+            <w:proofErr w:type="gramStart"/>
+            <w:r>
+              <w:rPr>
+                <w:rFonts w:ascii="Arial" w:eastAsia="KaiTi" w:hAnsi="Arial" w:cs="Arial"/>
+                <w:kern w:val="0"/>
+                <w:sz w:val="20"/>
+                <w:szCs w:val="20"/>
+              </w:rPr>
+              <w:t xml:space="preserve">9:30-10:30</w:t>
+            </w:r>
+          </w:p>
+          <w:p>
+            <w:pPr>
+              <w:widowControl/>
+              <w:snapToGrid w:val="0"/>
+              <w:spacing w:line="276" w:lineRule="auto"/>
+              <w:jc w:val="left"/>
+              <w:rPr>
+                <w:rFonts w:ascii="Arial" w:eastAsia="KaiTi" w:hAnsi="Arial" w:cs="Arial"/>
+                <w:bCs/>
+                <w:kern w:val="0"/>
+                <w:sz w:val="20"/>
+                <w:szCs w:val="20"/>
+              </w:rPr>
+            </w:pPr>
+            <w:r>
+              <w:rPr>
+                <w:rFonts w:ascii="Arial" w:eastAsia="KaiTi" w:hAnsi="Arial" w:cs="Arial"/>
+                <w:bCs/>
+                <w:kern w:val="0"/>
+                <w:sz w:val="20"/>
+                <w:szCs w:val="20"/>
+              </w:rPr>
+              <w:t xml:space="preserve">本地时间</w:t>
+            </w:r>
+          </w:p>
+          <w:p>
+            <w:pPr>
+              <w:widowControl/>
+              <w:snapToGrid w:val="0"/>
+              <w:spacing w:line="276" w:lineRule="auto"/>
+              <w:jc w:val="left"/>
+              <w:rPr>
+                <w:rFonts w:ascii="Arial" w:eastAsia="KaiTi" w:hAnsi="Arial" w:cs="Arial"/>
+                <w:bCs/>
+                <w:kern w:val="0"/>
+                <w:sz w:val="20"/>
+                <w:szCs w:val="20"/>
+              </w:rPr>
+            </w:pPr>
+          </w:p>
+          <w:p>
+            <w:pPr>
+              <w:widowControl/>
+              <w:jc w:val="left"/>
+              <w:rPr>
+                <w:rFonts w:ascii="Arial" w:eastAsia="KaiTi" w:hAnsi="Arial" w:cs="Arial"/>
+                <w:kern w:val="0"/>
+                <w:sz w:val="20"/>
+                <w:szCs w:val="20"/>
+              </w:rPr>
+            </w:pPr>
+            <w:proofErr w:type="gramStart"/>
+            <w:r>
+              <w:rPr>
+                <w:rFonts w:ascii="Arial" w:eastAsia="KaiTi" w:hAnsi="Arial" w:cs="Arial"/>
+                <w:kern w:val="0"/>
+                <w:sz w:val="20"/>
+                <w:szCs w:val="20"/>
+              </w:rPr>
+              <w:t xml:space="preserve">小组会</w:t>
+            </w:r>
+          </w:p>
+          <w:p>
+            <w:pPr>
+              <w:widowControl/>
+              <w:snapToGrid w:val="0"/>
+              <w:spacing w:line="276" w:lineRule="auto"/>
+              <w:jc w:val="left"/>
+              <w:rPr>
+                <w:rFonts w:ascii="Arial" w:eastAsia="KaiTi" w:hAnsi="Arial" w:cs="Arial"/>
+                <w:b/>
+                <w:kern w:val="0"/>
+                <w:sz w:val="20"/>
+                <w:szCs w:val="20"/>
+              </w:rPr>
+            </w:pPr>
+          </w:p>
+          <w:p>
+            <w:pPr>
+              <w:widowControl/>
+              <w:snapToGrid w:val="0"/>
+              <w:spacing w:line="276" w:lineRule="auto"/>
+              <w:jc w:val="left"/>
+              <w:rPr>
+                <w:rFonts w:ascii="Arial" w:eastAsia="KaiTi" w:hAnsi="Arial" w:cs="Arial"/>
+                <w:b/>
+                <w:kern w:val="0"/>
+                <w:sz w:val="20"/>
+                <w:szCs w:val="20"/>
+              </w:rPr>
+            </w:pPr>
+            <w:proofErr w:type="gramStart"/>
+            <w:r>
+              <w:rPr>
+                <w:rFonts w:ascii="Arial" w:eastAsia="KaiTi" w:hAnsi="Arial" w:cs="Arial"/>
+                <w:kern w:val="0"/>
+                <w:sz w:val="20"/>
+                <w:szCs w:val="20"/>
+              </w:rPr>
+              <w:t xml:space="preserve">中文</w:t>
+            </w:r>
+          </w:p>
+        </w:tc>
+        <w:tc>
+          <w:tcPr>
+            <w:tcW w:w="8585" w:type="dxa"/>
+            <w:tcBorders>
+              <w:top w:val="single" w:sz="4" w:space="0" w:color="auto"/>
+              <w:left w:val="nil"/>
+              <w:bottom w:val="single" w:sz="4" w:space="0" w:color="auto"/>
+              <w:right w:val="nil"/>
+            </w:tcBorders>
+          </w:tcPr>
+          <w:p>
+            <w:pPr>
+              <w:widowControl/>
+              <w:numPr>
+                <w:ilvl w:val="0"/>
+                <w:numId w:val="1"/>
+              </w:numPr>
+              <w:snapToGrid w:val="0"/>
+              <w:spacing w:before="60" w:after="60"/>
+              <w:ind w:right="144"/>
+              <w:jc w:val="left"/>
+              <w:rPr>
+                <w:rFonts w:ascii="Arial" w:eastAsia="KaiTi" w:hAnsi="Arial" w:cs="Arial"/>
+                <w:b/>
+                <w:kern w:val="0"/>
+                <w:sz w:val="20"/>
+                <w:szCs w:val="20"/>
+              </w:rPr>
+            </w:pPr>
+            <w:r>
+              <w:rPr>
+                <w:rFonts w:ascii="Arial" w:eastAsia="KaiTi" w:hAnsi="Arial" w:cs="Arial"/>
+                <w:b/>
+                <w:kern w:val="0"/>
+                <w:sz w:val="20"/>
+                <w:szCs w:val="20"/>
+              </w:rPr>
+              <w:t xml:space="preserve">投资者类型：</w:t>
+            </w:r>
+            <w:r>
+              <w:rPr>
+                <w:rFonts w:ascii="Arial" w:eastAsia="KaiTi" w:hAnsi="Arial" w:cs="Arial"/>
+                <w:kern w:val="0"/>
+                <w:sz w:val="20"/>
+                <w:szCs w:val="20"/>
+              </w:rPr>
+              <w:t xml:space="preserve">国际长线</w:t>
+            </w:r>
+          </w:p>
+          <w:p>
+            <w:pPr>
+              <w:widowControl/>
+              <w:numPr>
+                <w:ilvl w:val="0"/>
+                <w:numId w:val="1"/>
+              </w:numPr>
+              <w:snapToGrid w:val="0"/>
+              <w:spacing w:before="60" w:after="60"/>
+              <w:ind w:right="144"/>
+              <w:jc w:val="left"/>
+              <w:rPr>
+                <w:rFonts w:ascii="Arial" w:eastAsia="KaiTi" w:hAnsi="Arial" w:cs="Arial"/>
+                <w:b/>
+                <w:kern w:val="0"/>
+                <w:sz w:val="20"/>
+                <w:szCs w:val="20"/>
+              </w:rPr>
+            </w:pPr>
+            <w:r>
+              <w:rPr>
+                <w:rFonts w:ascii="Arial" w:eastAsia="KaiTi" w:hAnsi="Arial" w:cs="Arial"/>
+                <w:b/>
+                <w:kern w:val="0"/>
+                <w:sz w:val="20"/>
+                <w:szCs w:val="20"/>
+              </w:rPr>
+              <w:t xml:space="preserve">资产管理规模：</w:t>
+            </w:r>
+            <w:r>
+              <w:rPr>
+                <w:rFonts w:ascii="Arial" w:eastAsia="KaiTi" w:hAnsi="Arial" w:cs="Arial"/>
+                <w:kern w:val="0"/>
+                <w:sz w:val="20"/>
+                <w:szCs w:val="20"/>
+              </w:rPr>
+              <w:t xml:space="preserve">20亿美元</w:t>
+            </w:r>
+          </w:p>
+          <w:p>
+            <w:pPr>
+              <w:widowControl/>
+              <w:numPr>
+                <w:ilvl w:val="0"/>
+                <w:numId w:val="1"/>
+              </w:numPr>
+              <w:snapToGrid w:val="0"/>
+              <w:spacing w:before="60" w:after="60"/>
+              <w:ind w:right="144"/>
+              <w:jc w:val="left"/>
+              <w:rPr>
+                <w:rFonts w:ascii="Arial" w:eastAsia="KaiTi" w:hAnsi="Arial" w:cs="Arial"/>
+                <w:b/>
+                <w:kern w:val="0"/>
+                <w:sz w:val="20"/>
+                <w:szCs w:val="20"/>
+              </w:rPr>
+            </w:pPr>
+            <w:r>
+              <w:rPr>
+                <w:rFonts w:ascii="Arial" w:eastAsia="KaiTi" w:hAnsi="Arial" w:cs="Arial"/>
+                <w:b/>
+                <w:kern w:val="0"/>
+                <w:sz w:val="20"/>
+                <w:szCs w:val="20"/>
+              </w:rPr>
+              <w:t xml:space="preserve">参会人：</w:t>
+            </w:r>
+            <w:r>
+              <w:rPr>
+                <w:rFonts w:ascii="Arial" w:eastAsia="KaiTi" w:hAnsi="Arial" w:cs="Arial"/>
+                <w:kern w:val="0"/>
+                <w:sz w:val="20"/>
+                <w:szCs w:val="20"/>
+              </w:rPr>
+              <w:t xml:space="preserve">Kevin（董事总经理）</w:t>
+              <w:br/>
+              <w:t xml:space="preserve">Jason Ding（合伙人）</w:t>
+              <w:br/>
+              <w:t xml:space="preserve">Frank Li（合伙人）</w:t>
+            </w:r>
+          </w:p>
+          <w:p>
+            <w:pPr>
+              <w:widowControl/>
+              <w:numPr>
+                <w:ilvl w:val="0"/>
+                <w:numId w:val="1"/>
+              </w:numPr>
+              <w:snapToGrid w:val="0"/>
+              <w:spacing w:before="60" w:after="60"/>
+              <w:ind w:right="144"/>
+              <w:jc w:val="left"/>
+              <w:rPr>
+                <w:rFonts w:ascii="Arial" w:eastAsia="KaiTi" w:hAnsi="Arial" w:cs="Arial"/>
+                <w:b/>
+                <w:kern w:val="0"/>
+                <w:sz w:val="20"/>
+                <w:szCs w:val="20"/>
+              </w:rPr>
+            </w:pPr>
+            <w:r>
+              <w:rPr>
+                <w:rFonts w:ascii="Arial" w:eastAsia="KaiTi" w:hAnsi="Arial" w:cs="Arial"/>
+                <w:b/>
+                <w:kern w:val="0"/>
+                <w:sz w:val="20"/>
+                <w:szCs w:val="20"/>
+              </w:rPr>
+              <w:t>负责投行：</w:t>
+            </w:r>
+            <w:r>
+              <w:rPr>
+                <w:rFonts w:ascii="KaiTi" w:eastAsia="KaiTi" w:hAnsi="KaiTi"/>
+                <w:sz w:val="20"/>
+                <w:szCs w:val="20"/>
+              </w:rPr>
+              <w:t>招证国际</w:t>
+            </w:r>
+          </w:p>
+          <w:p>
+            <w:pPr>
+              <w:widowControl/>
+              <w:numPr>
+                <w:ilvl w:val="0"/>
+                <w:numId w:val="1"/>
+              </w:numPr>
+              <w:snapToGrid w:val="0"/>
+              <w:spacing w:before="60" w:after="60"/>
+              <w:ind w:right="144"/>
+              <w:jc w:val="left"/>
+              <w:rPr>
+                <w:rFonts w:ascii="Arial" w:eastAsia="KaiTi" w:hAnsi="Arial" w:cs="Arial"/>
+                <w:b/>
+                <w:kern w:val="0"/>
+                <w:sz w:val="20"/>
+                <w:szCs w:val="20"/>
+              </w:rPr>
+            </w:pPr>
+            <w:r>
+              <w:rPr>
+                <w:rFonts w:ascii="Arial" w:eastAsia="KaiTi" w:hAnsi="Arial" w:cs="Arial"/>
+                <w:b/>
+                <w:kern w:val="0"/>
+                <w:sz w:val="20"/>
+                <w:szCs w:val="20"/>
+              </w:rPr>
+              <w:t xml:space="preserve">投资者简介：</w:t>
+            </w:r>
+          </w:p>
+          <w:p>
+            <w:pPr>
+              <w:pStyle w:val="ListParagraph"/>
+              <w:widowControl/>
+              <w:numPr>
+                <w:ilvl w:val="0"/>
+                <w:numId w:val="4"/>
+              </w:numPr>
+              <w:snapToGrid w:val="0"/>
+              <w:spacing w:before="60" w:after="60"/>
+              <w:ind w:right="144"/>
+              <w:jc w:val="left"/>
+              <w:rPr>
+                <w:rFonts w:ascii="Arial" w:eastAsia="KaiTi" w:hAnsi="Arial" w:cs="Arial"/>
+                <w:b/>
+                <w:kern w:val="0"/>
+                <w:sz w:val="20"/>
+                <w:szCs w:val="20"/>
+              </w:rPr>
+            </w:pPr>
+            <w:proofErr w:type="gramStart"/>
+            <w:r>
+              <w:rPr>
+                <w:rFonts w:ascii="Arial" w:eastAsia="KaiTi" w:hAnsi="Arial" w:cs="Arial"/>
+                <w:kern w:val="0"/>
+                <w:sz w:val="20"/>
+                <w:szCs w:val="20"/>
+              </w:rPr>
+              <w:t xml:space="preserve">软银亚洲（SoftBank Venture Asia）是ICT行业（Information and Communications Technology，信息与通信技术）的早期到成长阶段的初创公司，包括人工智能、物联网和智能机器人。投资区域集中在亚洲、美国、以色列和欧盟。</w:t>
+            </w:r>
+            <w:r>
+              <w:rPr>
+                <w:rFonts w:ascii="Arial" w:eastAsia="KaiTi" w:hAnsi="Arial" w:cs="Arial"/>
+                <w:kern w:val="0"/>
+                <w:sz w:val="20"/>
+                <w:szCs w:val="20"/>
+              </w:rPr>
+              <w:t xml:space="preserve"/>
+            </w:r>
+          </w:p>
+          <w:p>
+            <w:pPr>
+              <w:pStyle w:val="ListParagraph"/>
+              <w:widowControl/>
+              <w:numPr>
+                <w:ilvl w:val="0"/>
+                <w:numId w:val="4"/>
+              </w:numPr>
+              <w:snapToGrid w:val="0"/>
+              <w:spacing w:before="60" w:after="60"/>
+              <w:ind w:right="144"/>
+              <w:jc w:val="left"/>
+              <w:rPr>
+                <w:rFonts w:ascii="Arial" w:eastAsia="KaiTi" w:hAnsi="Arial" w:cs="Arial"/>
+                <w:b/>
+                <w:kern w:val="0"/>
+                <w:sz w:val="20"/>
+                <w:szCs w:val="20"/>
+              </w:rPr>
+            </w:pPr>
+            <w:r>
+              <w:rPr>
+                <w:rFonts w:ascii="Arial" w:eastAsia="KaiTi" w:hAnsi="Arial" w:cs="Arial"/>
+                <w:kern w:val="0"/>
+                <w:sz w:val="20"/>
+                <w:szCs w:val="20"/>
+              </w:rPr>
+              <w:t xml:space="preserve">过往港股基石投资案例：</w:t>
+            </w:r>
+            <w:r>
+              <w:rPr>
+                <w:rFonts w:ascii="Arial" w:eastAsia="KaiTi" w:hAnsi="Arial" w:cs="Arial"/>
+                <w:kern w:val="0"/>
+                <w:sz w:val="20"/>
+                <w:szCs w:val="20"/>
+              </w:rPr>
+              <w:t xml:space="preserve">京东物流、众安在线</w:t>
+            </w:r>
+            <w:r>
+              <w:rPr>
+                <w:rFonts w:ascii="Arial" w:eastAsia="KaiTi" w:hAnsi="Arial" w:cs="Arial"/>
+                <w:kern w:val="0"/>
+                <w:sz w:val="20"/>
+                <w:szCs w:val="20"/>
+              </w:rPr>
+              <w:t>等</w:t>
+            </w:r>
+            <w:r>
+              <w:rPr>
+                <w:rFonts w:ascii="Arial" w:eastAsia="KaiTi" w:hAnsi="Arial" w:cs="Arial"/>
+                <w:kern w:val="0"/>
+                <w:sz w:val="20"/>
+                <w:szCs w:val="20"/>
+              </w:rPr>
+              <w:t xml:space="preserve"/>
+            </w:r>
+          </w:p>
+        </w:tc>
+      </w:tr>
+      <w:tr>
+        <w:trPr>
+          <w:jc w:val="center"/>
+        </w:trPr>
+        <w:tc>
+          <w:tcPr>
+            <w:tcW w:w="2327" w:type="dxa"/>
+            <w:tcBorders>
+              <w:top w:val="single" w:sz="4" w:space="0" w:color="auto"/>
+              <w:left w:val="nil"/>
+              <w:bottom w:val="single" w:sz="4" w:space="0" w:color="auto"/>
+              <w:right w:val="nil"/>
+            </w:tcBorders>
+          </w:tcPr>
+          <w:p>
+            <w:pPr>
+              <w:widowControl/>
+              <w:jc w:val="left"/>
+              <w:rPr>
+                <w:rFonts w:ascii="Arial" w:eastAsia="KaiTi" w:hAnsi="Arial" w:cs="Arial"/>
+                <w:sz w:val="20"/>
+                <w:szCs w:val="20"/>
+              </w:rPr>
+            </w:pPr>
+            <w:r>
+              <w:rPr>
+                <w:rFonts w:ascii="Arial" w:eastAsia="KaiTi" w:hAnsi="Arial" w:cs="Arial"/>
+                <w:sz w:val="20"/>
+                <w:szCs w:val="20"/>
+              </w:rPr>
+              <w:t xml:space="preserve"/>
+            </w:r>
+            <w:r>
+              <w:rPr>
+                <w:rFonts w:ascii="Arial" w:eastAsia="KaiTi" w:hAnsi="Arial" w:cs="Arial"/>
+                <w:b/>
+                <w:color w:val="000000"/>
+                <w:kern w:val="0"/>
+                <w:sz w:val="20"/>
+                <w:szCs w:val="20"/>
+              </w:rPr>
+              <w:t xml:space="preserve">Jump Trading</w:t>
+            </w:r>
+          </w:p>
+          <w:p>
+            <w:pPr>
+              <w:widowControl/>
+              <w:snapToGrid w:val="0"/>
+              <w:spacing w:line="276" w:lineRule="auto"/>
+              <w:jc w:val="left"/>
+              <w:rPr>
+                <w:rFonts w:ascii="Arial" w:eastAsia="KaiTi" w:hAnsi="Arial" w:cs="Arial"/>
+                <w:b/>
+                <w:bCs/>
+                <w:kern w:val="0"/>
+                <w:sz w:val="20"/>
+                <w:szCs w:val="20"/>
+              </w:rPr>
+            </w:pPr>
+          </w:p>
+          <w:p>
+            <w:pPr>
+              <w:widowControl/>
+              <w:snapToGrid w:val="0"/>
+              <w:spacing w:line="276" w:lineRule="auto"/>
+              <w:jc w:val="left"/>
+              <w:rPr>
+                <w:rFonts w:ascii="Arial" w:eastAsia="KaiTi" w:hAnsi="Arial" w:cs="Arial"/>
+                <w:b/>
+                <w:kern w:val="0"/>
+                <w:sz w:val="20"/>
+                <w:szCs w:val="20"/>
+              </w:rPr>
+            </w:pPr>
+            <w:r>
+              <w:rPr>
+                <w:rFonts w:ascii="Arial" w:eastAsia="KaiTi" w:hAnsi="Arial" w:cs="Arial"/>
+                <w:b/>
+                <w:kern w:val="0"/>
+                <w:sz w:val="20"/>
+                <w:szCs w:val="20"/>
+              </w:rPr>
+              <w:t>会议时间</w:t>
+            </w:r>
+            <w:r>
+              <w:rPr>
+                <w:rFonts w:ascii="Arial" w:eastAsia="KaiTi" w:hAnsi="Arial" w:cs="Arial"/>
+                <w:b/>
+                <w:kern w:val="0"/>
+                <w:sz w:val="20"/>
+                <w:szCs w:val="20"/>
+              </w:rPr>
+              <w:t xml:space="preserve">:</w:t>
+            </w:r>
+          </w:p>
+          <w:p>
+            <w:pPr>
+              <w:widowControl/>
+              <w:snapToGrid w:val="0"/>
+              <w:spacing w:line="276" w:lineRule="auto"/>
+              <w:jc w:val="left"/>
+              <w:rPr>
+                <w:rFonts w:ascii="Arial" w:eastAsia="KaiTi" w:hAnsi="Arial" w:cs="Arial"/>
+                <w:kern w:val="0"/>
+                <w:sz w:val="20"/>
+                <w:szCs w:val="20"/>
+              </w:rPr>
+            </w:pPr>
+            <w:proofErr w:type="gramStart"/>
+            <w:r>
+              <w:rPr>
+                <w:rFonts w:ascii="Arial" w:eastAsia="KaiTi" w:hAnsi="Arial" w:cs="Arial"/>
+                <w:kern w:val="0"/>
+                <w:sz w:val="20"/>
+                <w:szCs w:val="20"/>
+              </w:rPr>
+              <w:t xml:space="preserve">11:00-12:00</w:t>
+            </w:r>
+          </w:p>
+          <w:p>
+            <w:pPr>
+              <w:widowControl/>
+              <w:snapToGrid w:val="0"/>
+              <w:spacing w:line="276" w:lineRule="auto"/>
+              <w:jc w:val="left"/>
+              <w:rPr>
+                <w:rFonts w:ascii="Arial" w:eastAsia="KaiTi" w:hAnsi="Arial" w:cs="Arial"/>
+                <w:bCs/>
+                <w:kern w:val="0"/>
+                <w:sz w:val="20"/>
+                <w:szCs w:val="20"/>
+              </w:rPr>
+            </w:pPr>
+            <w:r>
+              <w:rPr>
+                <w:rFonts w:ascii="Arial" w:eastAsia="KaiTi" w:hAnsi="Arial" w:cs="Arial"/>
+                <w:bCs/>
+                <w:kern w:val="0"/>
+                <w:sz w:val="20"/>
+                <w:szCs w:val="20"/>
+              </w:rPr>
+              <w:t xml:space="preserve">本地时间</w:t>
+            </w:r>
+          </w:p>
+          <w:p>
+            <w:pPr>
+              <w:widowControl/>
+              <w:snapToGrid w:val="0"/>
+              <w:spacing w:line="276" w:lineRule="auto"/>
+              <w:jc w:val="left"/>
+              <w:rPr>
+                <w:rFonts w:ascii="Arial" w:eastAsia="KaiTi" w:hAnsi="Arial" w:cs="Arial"/>
+                <w:bCs/>
+                <w:kern w:val="0"/>
+                <w:sz w:val="20"/>
+                <w:szCs w:val="20"/>
+              </w:rPr>
+            </w:pPr>
+          </w:p>
+          <w:p>
+            <w:pPr>
+              <w:widowControl/>
+              <w:jc w:val="left"/>
+              <w:rPr>
+                <w:rFonts w:ascii="Arial" w:eastAsia="KaiTi" w:hAnsi="Arial" w:cs="Arial"/>
+                <w:kern w:val="0"/>
+                <w:sz w:val="20"/>
+                <w:szCs w:val="20"/>
+              </w:rPr>
+            </w:pPr>
+            <w:proofErr w:type="gramStart"/>
+            <w:r>
+              <w:rPr>
+                <w:rFonts w:ascii="Arial" w:eastAsia="KaiTi" w:hAnsi="Arial" w:cs="Arial"/>
+                <w:kern w:val="0"/>
+                <w:sz w:val="20"/>
+                <w:szCs w:val="20"/>
+              </w:rPr>
+              <w:t xml:space="preserve">1x1</w:t>
+            </w:r>
+          </w:p>
+          <w:p>
+            <w:pPr>
+              <w:widowControl/>
+              <w:snapToGrid w:val="0"/>
+              <w:spacing w:line="276" w:lineRule="auto"/>
+              <w:jc w:val="left"/>
+              <w:rPr>
+                <w:rFonts w:ascii="Arial" w:eastAsia="KaiTi" w:hAnsi="Arial" w:cs="Arial"/>
+                <w:b/>
+                <w:kern w:val="0"/>
+                <w:sz w:val="20"/>
+                <w:szCs w:val="20"/>
+              </w:rPr>
+            </w:pPr>
+          </w:p>
+          <w:p>
+            <w:pPr>
+              <w:widowControl/>
+              <w:snapToGrid w:val="0"/>
+              <w:spacing w:line="276" w:lineRule="auto"/>
+              <w:jc w:val="left"/>
+              <w:rPr>
+                <w:rFonts w:ascii="Arial" w:eastAsia="KaiTi" w:hAnsi="Arial" w:cs="Arial"/>
+                <w:b/>
+                <w:kern w:val="0"/>
+                <w:sz w:val="20"/>
+                <w:szCs w:val="20"/>
+              </w:rPr>
+            </w:pPr>
+            <w:proofErr w:type="gramStart"/>
+            <w:r>
+              <w:rPr>
+                <w:rFonts w:ascii="Arial" w:eastAsia="KaiTi" w:hAnsi="Arial" w:cs="Arial"/>
+                <w:kern w:val="0"/>
+                <w:sz w:val="20"/>
+                <w:szCs w:val="20"/>
+              </w:rPr>
+              <w:t xml:space="preserve">中文</w:t>
+            </w:r>
+          </w:p>
+        </w:tc>
+        <w:tc>
+          <w:tcPr>
+            <w:tcW w:w="8585" w:type="dxa"/>
+            <w:tcBorders>
+              <w:top w:val="single" w:sz="4" w:space="0" w:color="auto"/>
+              <w:left w:val="nil"/>
+              <w:bottom w:val="single" w:sz="4" w:space="0" w:color="auto"/>
+              <w:right w:val="nil"/>
+            </w:tcBorders>
+          </w:tcPr>
+          <w:p>
+            <w:pPr>
+              <w:widowControl/>
+              <w:numPr>
+                <w:ilvl w:val="0"/>
+                <w:numId w:val="1"/>
+              </w:numPr>
+              <w:snapToGrid w:val="0"/>
+              <w:spacing w:before="60" w:after="60"/>
+              <w:ind w:right="144"/>
+              <w:jc w:val="left"/>
+              <w:rPr>
+                <w:rFonts w:ascii="Arial" w:eastAsia="KaiTi" w:hAnsi="Arial" w:cs="Arial"/>
+                <w:b/>
+                <w:kern w:val="0"/>
+                <w:sz w:val="20"/>
+                <w:szCs w:val="20"/>
+              </w:rPr>
+            </w:pPr>
+            <w:r>
+              <w:rPr>
+                <w:rFonts w:ascii="Arial" w:eastAsia="KaiTi" w:hAnsi="Arial" w:cs="Arial"/>
+                <w:b/>
+                <w:kern w:val="0"/>
+                <w:sz w:val="20"/>
+                <w:szCs w:val="20"/>
+              </w:rPr>
+              <w:t xml:space="preserve">投资者类型：</w:t>
+            </w:r>
+            <w:r>
+              <w:rPr>
+                <w:rFonts w:ascii="Arial" w:eastAsia="KaiTi" w:hAnsi="Arial" w:cs="Arial"/>
+                <w:kern w:val="0"/>
+                <w:sz w:val="20"/>
+                <w:szCs w:val="20"/>
+              </w:rPr>
+              <w:t xml:space="preserve">多策略基金</w:t>
+            </w:r>
+          </w:p>
+          <w:p>
+            <w:pPr>
+              <w:widowControl/>
+              <w:numPr>
+                <w:ilvl w:val="0"/>
+                <w:numId w:val="1"/>
+              </w:numPr>
+              <w:snapToGrid w:val="0"/>
+              <w:spacing w:before="60" w:after="60"/>
+              <w:ind w:right="144"/>
+              <w:jc w:val="left"/>
+              <w:rPr>
+                <w:rFonts w:ascii="Arial" w:eastAsia="KaiTi" w:hAnsi="Arial" w:cs="Arial"/>
+                <w:b/>
+                <w:kern w:val="0"/>
+                <w:sz w:val="20"/>
+                <w:szCs w:val="20"/>
+              </w:rPr>
+            </w:pPr>
+            <w:r>
+              <w:rPr>
+                <w:rFonts w:ascii="Arial" w:eastAsia="KaiTi" w:hAnsi="Arial" w:cs="Arial"/>
+                <w:b/>
+                <w:kern w:val="0"/>
+                <w:sz w:val="20"/>
+                <w:szCs w:val="20"/>
+              </w:rPr>
+              <w:t xml:space="preserve">资产管理规模：</w:t>
+            </w:r>
+            <w:r>
+              <w:rPr>
+                <w:rFonts w:ascii="Arial" w:eastAsia="KaiTi" w:hAnsi="Arial" w:cs="Arial"/>
+                <w:kern w:val="0"/>
+                <w:sz w:val="20"/>
+                <w:szCs w:val="20"/>
+              </w:rPr>
+              <w:t xml:space="preserve">3.1亿美元</w:t>
+            </w:r>
+          </w:p>
+          <w:p>
+            <w:pPr>
+              <w:widowControl/>
+              <w:numPr>
+                <w:ilvl w:val="0"/>
+                <w:numId w:val="1"/>
+              </w:numPr>
+              <w:snapToGrid w:val="0"/>
+              <w:spacing w:before="60" w:after="60"/>
+              <w:ind w:right="144"/>
+              <w:jc w:val="left"/>
+              <w:rPr>
+                <w:rFonts w:ascii="Arial" w:eastAsia="KaiTi" w:hAnsi="Arial" w:cs="Arial"/>
+                <w:b/>
+                <w:kern w:val="0"/>
+                <w:sz w:val="20"/>
+                <w:szCs w:val="20"/>
+              </w:rPr>
+            </w:pPr>
+            <w:r>
+              <w:rPr>
+                <w:rFonts w:ascii="Arial" w:eastAsia="KaiTi" w:hAnsi="Arial" w:cs="Arial"/>
+                <w:b/>
+                <w:kern w:val="0"/>
+                <w:sz w:val="20"/>
+                <w:szCs w:val="20"/>
+              </w:rPr>
+              <w:t xml:space="preserve">参会人：</w:t>
+            </w:r>
+            <w:r>
+              <w:rPr>
+                <w:rFonts w:ascii="Arial" w:eastAsia="KaiTi" w:hAnsi="Arial" w:cs="Arial"/>
+                <w:kern w:val="0"/>
+                <w:sz w:val="20"/>
+                <w:szCs w:val="20"/>
+              </w:rPr>
+              <w:t xml:space="preserve">Edgar Hu （基金经理）</w:t>
+              <w:br/>
+              <w:t xml:space="preserve">文博（高级分析师）</w:t>
+              <w:br/>
+              <w:t xml:space="preserve">Phoebe Guo（基金经理）</w:t>
+            </w:r>
+          </w:p>
+          <w:p>
+            <w:pPr>
+              <w:widowControl/>
+              <w:numPr>
+                <w:ilvl w:val="0"/>
+                <w:numId w:val="1"/>
+              </w:numPr>
+              <w:snapToGrid w:val="0"/>
+              <w:spacing w:before="60" w:after="60"/>
+              <w:ind w:right="144"/>
+              <w:jc w:val="left"/>
+              <w:rPr>
+                <w:rFonts w:ascii="Arial" w:eastAsia="KaiTi" w:hAnsi="Arial" w:cs="Arial"/>
+                <w:b/>
+                <w:kern w:val="0"/>
+                <w:sz w:val="20"/>
+                <w:szCs w:val="20"/>
+              </w:rPr>
+            </w:pPr>
+            <w:r>
+              <w:rPr>
+                <w:rFonts w:ascii="Arial" w:eastAsia="KaiTi" w:hAnsi="Arial" w:cs="Arial"/>
+                <w:b/>
+                <w:kern w:val="0"/>
+                <w:sz w:val="20"/>
+                <w:szCs w:val="20"/>
+              </w:rPr>
+              <w:t>负责投行：</w:t>
+            </w:r>
+            <w:r>
+              <w:rPr>
+                <w:rFonts w:ascii="KaiTi" w:eastAsia="KaiTi" w:hAnsi="KaiTi"/>
+                <w:sz w:val="20"/>
+                <w:szCs w:val="20"/>
+              </w:rPr>
+              <w:t>招证国际</w:t>
+            </w:r>
+          </w:p>
+          <w:p>
+            <w:pPr>
+              <w:widowControl/>
+              <w:numPr>
+                <w:ilvl w:val="0"/>
+                <w:numId w:val="1"/>
+              </w:numPr>
+              <w:snapToGrid w:val="0"/>
+              <w:spacing w:before="60" w:after="60"/>
+              <w:ind w:right="144"/>
+              <w:jc w:val="left"/>
+              <w:rPr>
+                <w:rFonts w:ascii="Arial" w:eastAsia="KaiTi" w:hAnsi="Arial" w:cs="Arial"/>
+                <w:b/>
+                <w:kern w:val="0"/>
+                <w:sz w:val="20"/>
+                <w:szCs w:val="20"/>
+              </w:rPr>
+            </w:pPr>
+            <w:r>
+              <w:rPr>
+                <w:rFonts w:ascii="Arial" w:eastAsia="KaiTi" w:hAnsi="Arial" w:cs="Arial"/>
+                <w:b/>
+                <w:kern w:val="0"/>
+                <w:sz w:val="20"/>
+                <w:szCs w:val="20"/>
+              </w:rPr>
+              <w:t xml:space="preserve">投资者简介：</w:t>
+            </w:r>
+          </w:p>
+          <w:p>
+            <w:pPr>
+              <w:pStyle w:val="ListParagraph"/>
+              <w:widowControl/>
+              <w:numPr>
+                <w:ilvl w:val="0"/>
+                <w:numId w:val="4"/>
+              </w:numPr>
+              <w:snapToGrid w:val="0"/>
+              <w:spacing w:before="60" w:after="60"/>
+              <w:ind w:right="144"/>
+              <w:jc w:val="left"/>
+              <w:rPr>
+                <w:rFonts w:ascii="Arial" w:eastAsia="KaiTi" w:hAnsi="Arial" w:cs="Arial"/>
+                <w:b/>
+                <w:kern w:val="0"/>
+                <w:sz w:val="20"/>
+                <w:szCs w:val="20"/>
+              </w:rPr>
+            </w:pPr>
+            <w:proofErr w:type="gramStart"/>
+            <w:r>
+              <w:rPr>
+                <w:rFonts w:ascii="Arial" w:eastAsia="KaiTi" w:hAnsi="Arial" w:cs="Arial"/>
+                <w:kern w:val="0"/>
+                <w:sz w:val="20"/>
+                <w:szCs w:val="20"/>
+              </w:rPr>
+              <w:t xml:space="preserve">Jump Trading成立于 1999年，是一家专注于算法交易和高频交易策略的专营交易公司，活跃于全球期货、期权、加密货币和股票市场。研究人员、工程师和交易员并肩工作，将想法从概念转化为实际产品，兼具科学思维和快速、专注的迭代效率。公司的机器学习和人工智能专家直接与交易团队合作，专注于特定市场。Jump Trading积极关注港股市场投资机会，近期频繁参与A to H上市项目的基石投资，其重点布局领域包括消费与 TMT 赛道。</w:t>
+            </w:r>
+            <w:r>
+              <w:rPr>
+                <w:rFonts w:ascii="Arial" w:eastAsia="KaiTi" w:hAnsi="Arial" w:cs="Arial"/>
+                <w:kern w:val="0"/>
+                <w:sz w:val="20"/>
+                <w:szCs w:val="20"/>
+              </w:rPr>
+              <w:t xml:space="preserve"/>
+            </w:r>
+          </w:p>
+          <w:p>
+            <w:pPr>
+              <w:pStyle w:val="ListParagraph"/>
+              <w:widowControl/>
+              <w:numPr>
+                <w:ilvl w:val="0"/>
+                <w:numId w:val="4"/>
+              </w:numPr>
+              <w:snapToGrid w:val="0"/>
+              <w:spacing w:before="60" w:after="60"/>
+              <w:ind w:right="144"/>
+              <w:jc w:val="left"/>
+              <w:rPr>
+                <w:rFonts w:ascii="Arial" w:eastAsia="KaiTi" w:hAnsi="Arial" w:cs="Arial"/>
+                <w:b/>
+                <w:kern w:val="0"/>
+                <w:sz w:val="20"/>
+                <w:szCs w:val="20"/>
+              </w:rPr>
+            </w:pPr>
+            <w:r>
+              <w:rPr>
+                <w:rFonts w:ascii="Arial" w:eastAsia="KaiTi" w:hAnsi="Arial" w:cs="Arial"/>
+                <w:kern w:val="0"/>
+                <w:sz w:val="20"/>
+                <w:szCs w:val="20"/>
+              </w:rPr>
+              <w:t xml:space="preserve">过往港股基石投资案例：</w:t>
+            </w:r>
+            <w:r>
+              <w:rPr>
+                <w:rFonts w:ascii="Arial" w:eastAsia="KaiTi" w:hAnsi="Arial" w:cs="Arial"/>
+                <w:kern w:val="0"/>
+                <w:sz w:val="20"/>
+                <w:szCs w:val="20"/>
+              </w:rPr>
+              <w:t xml:space="preserve">胜宏科技、兆威机电、沃尔核材、均胜电子、赛力斯、周六福、美的集团</w:t>
             </w:r>
             <w:r>
               <w:rPr>
@@ -7990,7 +8941,7 @@
         <w:rPr>
           <w:rFonts w:ascii="Arial" w:eastAsia="KaiTi" w:hAnsi="Arial" w:cs="Arial"/>
           <w:b/>
-          <w:color w:val="002060"/>
+          <w:color w:val="FF9300"/>
           <w:kern w:val="0"/>
           <w:sz w:val="28"/>
           <w:szCs w:val="24"/>
@@ -8024,7 +8975,7 @@
           <w:tcPr>
             <w:tcW w:w="10912" w:type="dxa"/>
             <w:gridSpan w:val="2"/>
-            <w:shd w:val="clear" w:color="auto" w:fill="002060"/>
+            <w:shd w:val="clear" w:color="auto" w:fill="FF9300"/>
             <w:vAlign w:val="center"/>
           </w:tcPr>
           <w:p>
@@ -8200,9 +9151,7 @@
                 <w:sz w:val="20"/>
                 <w:szCs w:val="20"/>
               </w:rPr>
-              <w:t xml:space="preserve">GBA</w:t>
-              <w:br/>
-              <w:t xml:space="preserve">大湾区基金</w:t>
+              <w:t xml:space="preserve">Hudson River Trading</w:t>
             </w:r>
           </w:p>
           <w:p>
@@ -8277,7 +9226,7 @@
                 <w:sz w:val="20"/>
                 <w:szCs w:val="20"/>
               </w:rPr>
-              <w:t xml:space="preserve">9:30-10:30</w:t>
+              <w:t xml:space="preserve">14:00-15:00</w:t>
             </w:r>
           </w:p>
           <w:p>
@@ -8429,7 +9378,7 @@
                 <w:sz w:val="20"/>
                 <w:szCs w:val="20"/>
               </w:rPr>
-              <w:t xml:space="preserve">中资长线</w:t>
+              <w:t xml:space="preserve">多策略基金</w:t>
             </w:r>
           </w:p>
           <w:p>
@@ -8468,7 +9417,7 @@
                 <w:sz w:val="20"/>
                 <w:szCs w:val="20"/>
               </w:rPr>
-              <w:t xml:space="preserve">约600亿港元</w:t>
+              <w:t xml:space="preserve">超12亿美元</w:t>
             </w:r>
           </w:p>
           <w:p>
@@ -8507,33 +9456,480 @@
                 <w:sz w:val="20"/>
                 <w:szCs w:val="20"/>
               </w:rPr>
-              <w:t xml:space="preserve">Adonis Zhu（董事总经理）</w:t>
+              <w:t xml:space="preserve">Toh Zhen Zhou（基金经理）</w:t>
+            </w:r>
+          </w:p>
+          <w:p>
+            <w:pPr>
+              <w:widowControl/>
+              <w:numPr>
+                <w:ilvl w:val="0"/>
+                <w:numId w:val="1"/>
+              </w:numPr>
+              <w:snapToGrid w:val="0"/>
+              <w:spacing w:before="60" w:after="60"/>
+              <w:ind w:right="144"/>
+              <w:jc w:val="left"/>
+              <w:rPr>
+                <w:rFonts w:ascii="Arial" w:eastAsia="KaiTi" w:hAnsi="Arial" w:cs="Arial"/>
+                <w:b/>
+                <w:kern w:val="0"/>
+                <w:sz w:val="20"/>
+                <w:szCs w:val="20"/>
+              </w:rPr>
+            </w:pPr>
+            <w:r>
+              <w:rPr>
+                <w:rFonts w:ascii="Arial" w:eastAsia="KaiTi" w:hAnsi="Arial" w:cs="Arial"/>
+                <w:b/>
+                <w:kern w:val="0"/>
+                <w:sz w:val="20"/>
+                <w:szCs w:val="20"/>
+              </w:rPr>
+              <w:t>负责投行：</w:t>
+            </w:r>
+            <w:r>
+              <w:rPr>
+                <w:rFonts w:ascii="KaiTi" w:eastAsia="KaiTi" w:hAnsi="KaiTi"/>
+                <w:sz w:val="20"/>
+                <w:szCs w:val="20"/>
+              </w:rPr>
+              <w:t>招证国际</w:t>
+            </w:r>
+          </w:p>
+          <w:p>
+            <w:pPr>
+              <w:widowControl/>
+              <w:numPr>
+                <w:ilvl w:val="0"/>
+                <w:numId w:val="1"/>
+              </w:numPr>
+              <w:snapToGrid w:val="0"/>
+              <w:spacing w:before="60" w:after="60"/>
+              <w:ind w:right="144"/>
+              <w:jc w:val="left"/>
+              <w:rPr>
+                <w:rFonts w:ascii="Arial" w:eastAsia="KaiTi" w:hAnsi="Arial" w:cs="Arial"/>
+                <w:b/>
+                <w:kern w:val="0"/>
+                <w:sz w:val="20"/>
+                <w:szCs w:val="20"/>
+              </w:rPr>
+            </w:pPr>
+            <w:r>
+              <w:rPr>
+                <w:rFonts w:ascii="Arial" w:eastAsia="KaiTi" w:hAnsi="Arial" w:cs="Arial"/>
+                <w:b/>
+                <w:kern w:val="0"/>
+                <w:sz w:val="20"/>
+                <w:szCs w:val="20"/>
+              </w:rPr>
+              <w:t xml:space="preserve">投资者简介：</w:t>
+            </w:r>
+          </w:p>
+          <w:p>
+            <w:pPr>
+              <w:pStyle w:val="ListParagraph"/>
+              <w:widowControl/>
+              <w:numPr>
+                <w:ilvl w:val="0"/>
+                <w:numId w:val="4"/>
+              </w:numPr>
+              <w:snapToGrid w:val="0"/>
+              <w:spacing w:before="60" w:after="60"/>
+              <w:ind w:right="144"/>
+              <w:jc w:val="left"/>
+              <w:rPr>
+                <w:rFonts w:ascii="Arial" w:eastAsia="KaiTi" w:hAnsi="Arial" w:cs="Arial"/>
+                <w:b/>
+                <w:kern w:val="0"/>
+                <w:sz w:val="20"/>
+                <w:szCs w:val="20"/>
+              </w:rPr>
+            </w:pPr>
+            <w:proofErr w:type="gramStart"/>
+            <w:r>
+              <w:rPr>
+                <w:rFonts w:ascii="Arial" w:eastAsia="KaiTi" w:hAnsi="Arial" w:cs="Arial"/>
+                <w:kern w:val="0"/>
+                <w:sz w:val="20"/>
+                <w:szCs w:val="20"/>
+              </w:rPr>
+              <w:t xml:space="preserve">Hudson River Trading是一家成立于2002年、总部位于纽约的全球性量化交易与做市商。HRT由一群来自哈佛和MIT、拥有计算机科学和数学背景的合伙人创办，创始之初便希望通过技术手段彻底改变当时由人工主导的交易市场。经过二十余年的发展，HRT已从最初的美国股票市场拓展至全球几乎所有电子交易市场，并成长为与简街（Jane Street）、城堡证券（Citadel Securities）齐名的华尔街顶级量化交易机构</w:t>
+            </w:r>
+            <w:r>
+              <w:rPr>
+                <w:rFonts w:ascii="Arial" w:eastAsia="KaiTi" w:hAnsi="Arial" w:cs="Arial"/>
+                <w:kern w:val="0"/>
+                <w:sz w:val="20"/>
+                <w:szCs w:val="20"/>
+              </w:rPr>
+              <w:t xml:space="preserve"/>
+            </w:r>
+          </w:p>
+        </w:tc>
+      </w:tr>
+      <w:tr>
+        <w:trPr>
+          <w:jc w:val="center"/>
+        </w:trPr>
+        <w:tc>
+          <w:tcPr>
+            <w:tcW w:w="2327" w:type="dxa"/>
+            <w:tcBorders>
+              <w:top w:val="single" w:sz="4" w:space="0" w:color="auto"/>
+              <w:left w:val="nil"/>
+              <w:bottom w:val="single" w:sz="4" w:space="0" w:color="auto"/>
+              <w:right w:val="nil"/>
+            </w:tcBorders>
+          </w:tcPr>
+          <w:p>
+            <w:pPr>
+              <w:widowControl/>
+              <w:jc w:val="left"/>
+              <w:rPr>
+                <w:rFonts w:ascii="Arial" w:eastAsia="KaiTi" w:hAnsi="Arial" w:cs="Arial"/>
+                <w:sz w:val="20"/>
+                <w:szCs w:val="20"/>
+              </w:rPr>
+            </w:pPr>
+            <w:r>
+              <w:rPr>
+                <w:rFonts w:ascii="Arial" w:eastAsia="KaiTi" w:hAnsi="Arial" w:cs="Arial"/>
+                <w:sz w:val="20"/>
+                <w:szCs w:val="20"/>
+              </w:rPr>
+              <w:t xml:space="preserve"/>
+            </w:r>
+            <w:r>
+              <w:rPr>
+                <w:rFonts w:ascii="Arial" w:eastAsia="KaiTi" w:hAnsi="Arial" w:cs="Arial"/>
+                <w:b/>
+                <w:color w:val="000000"/>
+                <w:kern w:val="0"/>
+                <w:sz w:val="20"/>
+                <w:szCs w:val="20"/>
+              </w:rPr>
+              <w:t xml:space="preserve">JPM AM</w:t>
               <w:br/>
-              <w:t xml:space="preserve">LUO Cheng, Adonis ZHU（执行董事）</w:t>
-              <w:br/>
-              <w:t xml:space="preserve">Yolanda Yin（资深分析师）</w:t>
-              <w:br/>
-              <w:t xml:space="preserve">张琼（资深分析师）</w:t>
-              <w:br/>
-              <w:t xml:space="preserve">Zena Zhang（资深分析师）</w:t>
+              <w:t xml:space="preserve">JP摩根资管</w:t>
+            </w:r>
+          </w:p>
+          <w:p>
+            <w:pPr>
+              <w:widowControl/>
+              <w:snapToGrid w:val="0"/>
+              <w:spacing w:line="276" w:lineRule="auto"/>
+              <w:jc w:val="left"/>
+              <w:rPr>
+                <w:rFonts w:ascii="Arial" w:eastAsia="KaiTi" w:hAnsi="Arial" w:cs="Arial"/>
+                <w:b/>
+                <w:bCs/>
+                <w:kern w:val="0"/>
+                <w:sz w:val="20"/>
+                <w:szCs w:val="20"/>
+              </w:rPr>
+            </w:pPr>
+          </w:p>
+          <w:p>
+            <w:pPr>
+              <w:widowControl/>
+              <w:snapToGrid w:val="0"/>
+              <w:spacing w:line="276" w:lineRule="auto"/>
+              <w:jc w:val="left"/>
+              <w:rPr>
+                <w:rFonts w:ascii="Arial" w:eastAsia="KaiTi" w:hAnsi="Arial" w:cs="Arial"/>
+                <w:b/>
+                <w:kern w:val="0"/>
+                <w:sz w:val="20"/>
+                <w:szCs w:val="20"/>
+              </w:rPr>
+            </w:pPr>
+            <w:r>
+              <w:rPr>
+                <w:rFonts w:ascii="Arial" w:eastAsia="KaiTi" w:hAnsi="Arial" w:cs="Arial"/>
+                <w:b/>
+                <w:kern w:val="0"/>
+                <w:sz w:val="20"/>
+                <w:szCs w:val="20"/>
+              </w:rPr>
+              <w:t>会议时间</w:t>
+            </w:r>
+            <w:r>
+              <w:rPr>
+                <w:rFonts w:ascii="Arial" w:eastAsia="KaiTi" w:hAnsi="Arial" w:cs="Arial"/>
+                <w:b/>
+                <w:kern w:val="0"/>
+                <w:sz w:val="20"/>
+                <w:szCs w:val="20"/>
+              </w:rPr>
+              <w:t xml:space="preserve">:</w:t>
+            </w:r>
+          </w:p>
+          <w:p>
+            <w:pPr>
+              <w:widowControl/>
+              <w:snapToGrid w:val="0"/>
+              <w:spacing w:line="276" w:lineRule="auto"/>
+              <w:jc w:val="left"/>
+              <w:rPr>
+                <w:rFonts w:ascii="Arial" w:eastAsia="KaiTi" w:hAnsi="Arial" w:cs="Arial"/>
+                <w:kern w:val="0"/>
+                <w:sz w:val="20"/>
+                <w:szCs w:val="20"/>
+              </w:rPr>
+            </w:pPr>
+            <w:proofErr w:type="gramStart"/>
+            <w:r>
+              <w:rPr>
+                <w:rFonts w:ascii="Arial" w:eastAsia="KaiTi" w:hAnsi="Arial" w:cs="Arial"/>
+                <w:kern w:val="0"/>
+                <w:sz w:val="20"/>
+                <w:szCs w:val="20"/>
+              </w:rPr>
+              <w:t xml:space="preserve">14:00-15:00</w:t>
+            </w:r>
+          </w:p>
+          <w:p>
+            <w:pPr>
+              <w:widowControl/>
+              <w:snapToGrid w:val="0"/>
+              <w:spacing w:line="276" w:lineRule="auto"/>
+              <w:jc w:val="left"/>
+              <w:rPr>
+                <w:rFonts w:ascii="Arial" w:eastAsia="KaiTi" w:hAnsi="Arial" w:cs="Arial"/>
+                <w:bCs/>
+                <w:kern w:val="0"/>
+                <w:sz w:val="20"/>
+                <w:szCs w:val="20"/>
+              </w:rPr>
+            </w:pPr>
+            <w:r>
+              <w:rPr>
+                <w:rFonts w:ascii="Arial" w:eastAsia="KaiTi" w:hAnsi="Arial" w:cs="Arial"/>
+                <w:bCs/>
+                <w:kern w:val="0"/>
+                <w:sz w:val="20"/>
+                <w:szCs w:val="20"/>
+              </w:rPr>
+              <w:t xml:space="preserve">本地时间</w:t>
+            </w:r>
+          </w:p>
+          <w:p>
+            <w:pPr>
+              <w:widowControl/>
+              <w:snapToGrid w:val="0"/>
+              <w:spacing w:line="276" w:lineRule="auto"/>
+              <w:jc w:val="left"/>
+              <w:rPr>
+                <w:rFonts w:ascii="Arial" w:eastAsia="KaiTi" w:hAnsi="Arial" w:cs="Arial"/>
+                <w:bCs/>
+                <w:kern w:val="0"/>
+                <w:sz w:val="20"/>
+                <w:szCs w:val="20"/>
+              </w:rPr>
+            </w:pPr>
+          </w:p>
+          <w:p>
+            <w:pPr>
+              <w:widowControl/>
+              <w:jc w:val="left"/>
+              <w:rPr>
+                <w:rFonts w:ascii="Arial" w:eastAsia="KaiTi" w:hAnsi="Arial" w:cs="Arial"/>
+                <w:kern w:val="0"/>
+                <w:sz w:val="20"/>
+                <w:szCs w:val="20"/>
+              </w:rPr>
+            </w:pPr>
+            <w:proofErr w:type="gramStart"/>
+            <w:r>
+              <w:rPr>
+                <w:rFonts w:ascii="Arial" w:eastAsia="KaiTi" w:hAnsi="Arial" w:cs="Arial"/>
+                <w:kern w:val="0"/>
+                <w:sz w:val="20"/>
+                <w:szCs w:val="20"/>
+              </w:rPr>
+              <w:t xml:space="preserve">小组会</w:t>
+            </w:r>
+          </w:p>
+          <w:p>
+            <w:pPr>
+              <w:widowControl/>
+              <w:snapToGrid w:val="0"/>
+              <w:spacing w:line="276" w:lineRule="auto"/>
+              <w:jc w:val="left"/>
+              <w:rPr>
+                <w:rFonts w:ascii="Arial" w:eastAsia="KaiTi" w:hAnsi="Arial" w:cs="Arial"/>
+                <w:b/>
+                <w:kern w:val="0"/>
+                <w:sz w:val="20"/>
+                <w:szCs w:val="20"/>
+              </w:rPr>
+            </w:pPr>
+          </w:p>
+          <w:p>
+            <w:pPr>
+              <w:widowControl/>
+              <w:snapToGrid w:val="0"/>
+              <w:spacing w:line="276" w:lineRule="auto"/>
+              <w:jc w:val="left"/>
+              <w:rPr>
+                <w:rFonts w:ascii="Arial" w:eastAsia="KaiTi" w:hAnsi="Arial" w:cs="Arial"/>
+                <w:b/>
+                <w:kern w:val="0"/>
+                <w:sz w:val="20"/>
+                <w:szCs w:val="20"/>
+              </w:rPr>
+            </w:pPr>
+            <w:proofErr w:type="gramStart"/>
+            <w:r>
+              <w:rPr>
+                <w:rFonts w:ascii="Arial" w:eastAsia="KaiTi" w:hAnsi="Arial" w:cs="Arial"/>
+                <w:kern w:val="0"/>
+                <w:sz w:val="20"/>
+                <w:szCs w:val="20"/>
+              </w:rPr>
+              <w:t xml:space="preserve">中文</w:t>
+            </w:r>
+          </w:p>
+        </w:tc>
+        <w:tc>
+          <w:tcPr>
+            <w:tcW w:w="8585" w:type="dxa"/>
+            <w:tcBorders>
+              <w:top w:val="single" w:sz="4" w:space="0" w:color="auto"/>
+              <w:left w:val="nil"/>
+              <w:bottom w:val="single" w:sz="4" w:space="0" w:color="auto"/>
+              <w:right w:val="nil"/>
+            </w:tcBorders>
+          </w:tcPr>
+          <w:p>
+            <w:pPr>
+              <w:widowControl/>
+              <w:numPr>
+                <w:ilvl w:val="0"/>
+                <w:numId w:val="1"/>
+              </w:numPr>
+              <w:snapToGrid w:val="0"/>
+              <w:spacing w:before="60" w:after="60"/>
+              <w:ind w:right="144"/>
+              <w:jc w:val="left"/>
+              <w:rPr>
+                <w:rFonts w:ascii="Arial" w:eastAsia="KaiTi" w:hAnsi="Arial" w:cs="Arial"/>
+                <w:b/>
+                <w:kern w:val="0"/>
+                <w:sz w:val="20"/>
+                <w:szCs w:val="20"/>
+              </w:rPr>
+            </w:pPr>
+            <w:r>
+              <w:rPr>
+                <w:rFonts w:ascii="Arial" w:eastAsia="KaiTi" w:hAnsi="Arial" w:cs="Arial"/>
+                <w:b/>
+                <w:kern w:val="0"/>
+                <w:sz w:val="20"/>
+                <w:szCs w:val="20"/>
+              </w:rPr>
+              <w:t xml:space="preserve">投资者类型：</w:t>
+            </w:r>
+            <w:r>
+              <w:rPr>
+                <w:rFonts w:ascii="Arial" w:eastAsia="KaiTi" w:hAnsi="Arial" w:cs="Arial"/>
+                <w:kern w:val="0"/>
+                <w:sz w:val="20"/>
+                <w:szCs w:val="20"/>
+              </w:rPr>
+              <w:t xml:space="preserve">国际长线</w:t>
+            </w:r>
+          </w:p>
+          <w:p>
+            <w:pPr>
+              <w:widowControl/>
+              <w:numPr>
+                <w:ilvl w:val="0"/>
+                <w:numId w:val="1"/>
+              </w:numPr>
+              <w:snapToGrid w:val="0"/>
+              <w:spacing w:before="60" w:after="60"/>
+              <w:ind w:right="144"/>
+              <w:jc w:val="left"/>
+              <w:rPr>
+                <w:rFonts w:ascii="Arial" w:eastAsia="KaiTi" w:hAnsi="Arial" w:cs="Arial"/>
+                <w:b/>
+                <w:kern w:val="0"/>
+                <w:sz w:val="20"/>
+                <w:szCs w:val="20"/>
+              </w:rPr>
+            </w:pPr>
+            <w:r>
+              <w:rPr>
+                <w:rFonts w:ascii="Arial" w:eastAsia="KaiTi" w:hAnsi="Arial" w:cs="Arial"/>
+                <w:b/>
+                <w:kern w:val="0"/>
+                <w:sz w:val="20"/>
+                <w:szCs w:val="20"/>
+              </w:rPr>
+              <w:t xml:space="preserve">资产管理规模：</w:t>
+            </w:r>
+            <w:r>
+              <w:rPr>
+                <w:rFonts w:ascii="Arial" w:eastAsia="KaiTi" w:hAnsi="Arial" w:cs="Arial"/>
+                <w:kern w:val="0"/>
+                <w:sz w:val="20"/>
+                <w:szCs w:val="20"/>
+              </w:rPr>
+              <w:t xml:space="preserve">3万亿美元</w:t>
+            </w:r>
+          </w:p>
+          <w:p>
+            <w:pPr>
+              <w:widowControl/>
+              <w:numPr>
+                <w:ilvl w:val="0"/>
+                <w:numId w:val="1"/>
+              </w:numPr>
+              <w:snapToGrid w:val="0"/>
+              <w:spacing w:before="60" w:after="60"/>
+              <w:ind w:right="144"/>
+              <w:jc w:val="left"/>
+              <w:rPr>
+                <w:rFonts w:ascii="Arial" w:eastAsia="KaiTi" w:hAnsi="Arial" w:cs="Arial"/>
+                <w:b/>
+                <w:kern w:val="0"/>
+                <w:sz w:val="20"/>
+                <w:szCs w:val="20"/>
+              </w:rPr>
+            </w:pPr>
+            <w:r>
+              <w:rPr>
+                <w:rFonts w:ascii="Arial" w:eastAsia="KaiTi" w:hAnsi="Arial" w:cs="Arial"/>
+                <w:b/>
+                <w:kern w:val="0"/>
+                <w:sz w:val="20"/>
+                <w:szCs w:val="20"/>
+              </w:rPr>
+              <w:t xml:space="preserve">参会人：</w:t>
+            </w:r>
+            <w:r>
+              <w:rPr>
+                <w:rFonts w:ascii="Arial" w:eastAsia="KaiTi" w:hAnsi="Arial" w:cs="Arial"/>
+                <w:kern w:val="0"/>
+                <w:sz w:val="20"/>
+                <w:szCs w:val="20"/>
+              </w:rPr>
+              <w:t xml:space="preserve">Luka Zhu（资深研究员）</w:t>
               <w:br/>
               <w:t xml:space="preserve"/>
               <w:br/>
               <w:t xml:space="preserve">远景动力：</w:t>
               <w:br/>
-              <w:t xml:space="preserve">胡章宏（董事长）</w:t>
+              <w:t xml:space="preserve">Howard Wang（大中华区投资总监）</w:t>
               <w:br/>
-              <w:t xml:space="preserve">殷聰（总经理）</w:t>
+              <w:t xml:space="preserve">Mark Mao（执行总经理）</w:t>
               <w:br/>
-              <w:t xml:space="preserve">祝昱华（董事总经理）</w:t>
+              <w:t xml:space="preserve">Penny Tu（基金经理）</w:t>
               <w:br/>
-              <w:t xml:space="preserve">王建平（董事总经理）</w:t>
-              <w:br/>
-              <w:t xml:space="preserve">黄炜（执行总监）"</w:t>
-              <w:br/>
-              <w:t xml:space="preserve"/>
-              <w:br/>
-              <w:t xml:space="preserve">阿麦斯：Icey Tao（资深研究员）</w:t>
+              <w:t xml:space="preserve">Julie Ho（基金经理）"</w:t>
             </w:r>
           </w:p>
           <w:p>
@@ -8632,7 +10028,7 @@
                 <w:sz w:val="20"/>
                 <w:szCs w:val="20"/>
               </w:rPr>
-              <w:t xml:space="preserve">大湾区基金（GBA Homeland Development Fund）由国际大型产业机构、金融机构以及新经济企业联合发起成立，旗下设立大湾区共同家园发展基金，旨在把握粤港澳大湾区发展、国际科创中心建设等历史机遇，聚焦科技创新、产业升级、美好生活、智慧城市等相关领域，覆盖风险投资、私募股权投资、上市公司投资、并购投资等项目全生命周期，为优秀的创业者和企业提供资金支持、对接产业和金融资源，为股东和投资者实现长期回报，为经济和社会发展贡献积极力量。资产管理规模约600亿港元。</w:t>
+              <w:t xml:space="preserve">JP摩根资产管理（J.P. Morgan Asset Management）隶属于摩根大通集团，是全球领先的综合性资产管理机构之一，为机构投资者、零售客户及高净值客户提供多元化投资解决方案。公司业务覆盖全球主要市场，投资范围涵盖股票、固定收益、多资产、房地产、对冲基金、私募股权及流动性管理等主要资产类别。截至2025年中，摩根资产管理全球管理规模约为3.9万亿美元，在全球资产管理行业中位居前列</w:t>
             </w:r>
             <w:r>
               <w:rPr>
@@ -8680,7 +10076,7 @@
                 <w:sz w:val="20"/>
                 <w:szCs w:val="20"/>
               </w:rPr>
-              <w:t xml:space="preserve">广合科技、精锋医疗-B、智汇矿业、紫金黄金国际、大行科工、FORITOR、蓝思科技、IFBH、三花智控、毛戈平、蓝月亮集团、正荣服务、永泰生物-B等</w:t>
+              <w:t xml:space="preserve">华勤技术、东鹏饮料</w:t>
             </w:r>
             <w:r>
               <w:rPr>
@@ -8744,9 +10140,9 @@
                 <w:sz w:val="20"/>
                 <w:szCs w:val="20"/>
               </w:rPr>
-              <w:t xml:space="preserve">SoftBank Venture Asia</w:t>
+              <w:t xml:space="preserve">Longrising AM</w:t>
               <w:br/>
-              <w:t xml:space="preserve">软银亚洲</w:t>
+              <w:t xml:space="preserve">源乐晟</w:t>
             </w:r>
           </w:p>
           <w:p>
@@ -8821,7 +10217,7 @@
                 <w:sz w:val="20"/>
                 <w:szCs w:val="20"/>
               </w:rPr>
-              <w:t xml:space="preserve">9:30-10:30</w:t>
+              <w:t xml:space="preserve">14:00-15:00</w:t>
             </w:r>
           </w:p>
           <w:p>
@@ -8973,7 +10369,7 @@
                 <w:sz w:val="20"/>
                 <w:szCs w:val="20"/>
               </w:rPr>
-              <w:t xml:space="preserve">国际长线</w:t>
+              <w:t xml:space="preserve">中资长线</w:t>
             </w:r>
           </w:p>
           <w:p>
@@ -9012,7 +10408,7 @@
                 <w:sz w:val="20"/>
                 <w:szCs w:val="20"/>
               </w:rPr>
-              <w:t xml:space="preserve">20亿美元</w:t>
+              <w:t xml:space="preserve">超400亿人民币</w:t>
             </w:r>
           </w:p>
           <w:p>
@@ -9051,11 +10447,7 @@
                 <w:sz w:val="20"/>
                 <w:szCs w:val="20"/>
               </w:rPr>
-              <w:t xml:space="preserve">Kevin（董事总经理）</w:t>
-              <w:br/>
-              <w:t xml:space="preserve">Jason Ding（合伙人）</w:t>
-              <w:br/>
-              <w:t xml:space="preserve">Frank Li（合伙人）</w:t>
+              <w:t xml:space="preserve">杨建海（基金经理）</w:t>
             </w:r>
           </w:p>
           <w:p>
@@ -9154,7 +10546,7 @@
                 <w:sz w:val="20"/>
                 <w:szCs w:val="20"/>
               </w:rPr>
-              <w:t xml:space="preserve">软银亚洲（SoftBank Venture Asia）是ICT行业（Information and Communications Technology，信息与通信技术）的早期到成长阶段的初创公司，包括人工智能、物联网和智能机器人。投资区域集中在亚洲、美国、以色列和欧盟。</w:t>
+              <w:t xml:space="preserve">源乐晟资产管理有限公司（Longrising Asset Management）成立于2008年3月，是国内知名的私募证券投资基金管理人，旗下设有北京源乐晟资产与西藏源乐晟资产两个平行平台。公司在投资管理上遵循“相信价值、尊重市场、寻找GARP、理解盈亏同源”的投资理念，致力于挖掘景气周期中的优秀企业，为投资者提供可持续创造稳健收益的财富管理服务。</w:t>
             </w:r>
             <w:r>
               <w:rPr>
@@ -9202,527 +10594,7 @@
                 <w:sz w:val="20"/>
                 <w:szCs w:val="20"/>
               </w:rPr>
-              <w:t xml:space="preserve">京东物流、众安在线</w:t>
-            </w:r>
-            <w:r>
-              <w:rPr>
-                <w:rFonts w:ascii="Arial" w:eastAsia="KaiTi" w:hAnsi="Arial" w:cs="Arial"/>
-                <w:kern w:val="0"/>
-                <w:sz w:val="20"/>
-                <w:szCs w:val="20"/>
-              </w:rPr>
-              <w:t>等</w:t>
-            </w:r>
-            <w:r>
-              <w:rPr>
-                <w:rFonts w:ascii="Arial" w:eastAsia="KaiTi" w:hAnsi="Arial" w:cs="Arial"/>
-                <w:kern w:val="0"/>
-                <w:sz w:val="20"/>
-                <w:szCs w:val="20"/>
-              </w:rPr>
-              <w:t xml:space="preserve"/>
-            </w:r>
-          </w:p>
-        </w:tc>
-      </w:tr>
-      <w:tr>
-        <w:trPr>
-          <w:jc w:val="center"/>
-        </w:trPr>
-        <w:tc>
-          <w:tcPr>
-            <w:tcW w:w="2327" w:type="dxa"/>
-            <w:tcBorders>
-              <w:top w:val="single" w:sz="4" w:space="0" w:color="auto"/>
-              <w:left w:val="nil"/>
-              <w:bottom w:val="single" w:sz="4" w:space="0" w:color="auto"/>
-              <w:right w:val="nil"/>
-            </w:tcBorders>
-          </w:tcPr>
-          <w:p>
-            <w:pPr>
-              <w:widowControl/>
-              <w:jc w:val="left"/>
-              <w:rPr>
-                <w:rFonts w:ascii="Arial" w:eastAsia="KaiTi" w:hAnsi="Arial" w:cs="Arial"/>
-                <w:sz w:val="20"/>
-                <w:szCs w:val="20"/>
-              </w:rPr>
-            </w:pPr>
-            <w:r>
-              <w:rPr>
-                <w:rFonts w:ascii="Arial" w:eastAsia="KaiTi" w:hAnsi="Arial" w:cs="Arial"/>
-                <w:sz w:val="20"/>
-                <w:szCs w:val="20"/>
-              </w:rPr>
-              <w:t xml:space="preserve"/>
-            </w:r>
-            <w:r>
-              <w:rPr>
-                <w:rFonts w:ascii="Arial" w:eastAsia="KaiTi" w:hAnsi="Arial" w:cs="Arial"/>
-                <w:b/>
-                <w:color w:val="000000"/>
-                <w:kern w:val="0"/>
-                <w:sz w:val="20"/>
-                <w:szCs w:val="20"/>
-              </w:rPr>
-              <w:t xml:space="preserve">Jump Trading</w:t>
-            </w:r>
-          </w:p>
-          <w:p>
-            <w:pPr>
-              <w:widowControl/>
-              <w:snapToGrid w:val="0"/>
-              <w:spacing w:line="276" w:lineRule="auto"/>
-              <w:jc w:val="left"/>
-              <w:rPr>
-                <w:rFonts w:ascii="Arial" w:eastAsia="KaiTi" w:hAnsi="Arial" w:cs="Arial"/>
-                <w:b/>
-                <w:bCs/>
-                <w:kern w:val="0"/>
-                <w:sz w:val="20"/>
-                <w:szCs w:val="20"/>
-              </w:rPr>
-            </w:pPr>
-          </w:p>
-          <w:p>
-            <w:pPr>
-              <w:widowControl/>
-              <w:snapToGrid w:val="0"/>
-              <w:spacing w:line="276" w:lineRule="auto"/>
-              <w:jc w:val="left"/>
-              <w:rPr>
-                <w:rFonts w:ascii="Arial" w:eastAsia="KaiTi" w:hAnsi="Arial" w:cs="Arial"/>
-                <w:b/>
-                <w:kern w:val="0"/>
-                <w:sz w:val="20"/>
-                <w:szCs w:val="20"/>
-              </w:rPr>
-            </w:pPr>
-            <w:r>
-              <w:rPr>
-                <w:rFonts w:ascii="Arial" w:eastAsia="KaiTi" w:hAnsi="Arial" w:cs="Arial"/>
-                <w:b/>
-                <w:kern w:val="0"/>
-                <w:sz w:val="20"/>
-                <w:szCs w:val="20"/>
-              </w:rPr>
-              <w:t>会议时间</w:t>
-            </w:r>
-            <w:r>
-              <w:rPr>
-                <w:rFonts w:ascii="Arial" w:eastAsia="KaiTi" w:hAnsi="Arial" w:cs="Arial"/>
-                <w:b/>
-                <w:kern w:val="0"/>
-                <w:sz w:val="20"/>
-                <w:szCs w:val="20"/>
-              </w:rPr>
-              <w:t xml:space="preserve">:</w:t>
-            </w:r>
-          </w:p>
-          <w:p>
-            <w:pPr>
-              <w:widowControl/>
-              <w:snapToGrid w:val="0"/>
-              <w:spacing w:line="276" w:lineRule="auto"/>
-              <w:jc w:val="left"/>
-              <w:rPr>
-                <w:rFonts w:ascii="Arial" w:eastAsia="KaiTi" w:hAnsi="Arial" w:cs="Arial"/>
-                <w:kern w:val="0"/>
-                <w:sz w:val="20"/>
-                <w:szCs w:val="20"/>
-              </w:rPr>
-            </w:pPr>
-            <w:proofErr w:type="gramStart"/>
-            <w:r>
-              <w:rPr>
-                <w:rFonts w:ascii="Arial" w:eastAsia="KaiTi" w:hAnsi="Arial" w:cs="Arial"/>
-                <w:kern w:val="0"/>
-                <w:sz w:val="20"/>
-                <w:szCs w:val="20"/>
-              </w:rPr>
-              <w:t xml:space="preserve">11:00-12:00</w:t>
-            </w:r>
-          </w:p>
-          <w:p>
-            <w:pPr>
-              <w:widowControl/>
-              <w:snapToGrid w:val="0"/>
-              <w:spacing w:line="276" w:lineRule="auto"/>
-              <w:jc w:val="left"/>
-              <w:rPr>
-                <w:rFonts w:ascii="Arial" w:eastAsia="KaiTi" w:hAnsi="Arial" w:cs="Arial"/>
-                <w:bCs/>
-                <w:kern w:val="0"/>
-                <w:sz w:val="20"/>
-                <w:szCs w:val="20"/>
-              </w:rPr>
-            </w:pPr>
-            <w:r>
-              <w:rPr>
-                <w:rFonts w:ascii="Arial" w:eastAsia="KaiTi" w:hAnsi="Arial" w:cs="Arial"/>
-                <w:bCs/>
-                <w:kern w:val="0"/>
-                <w:sz w:val="20"/>
-                <w:szCs w:val="20"/>
-              </w:rPr>
-              <w:t xml:space="preserve">本地时间</w:t>
-            </w:r>
-          </w:p>
-          <w:p>
-            <w:pPr>
-              <w:widowControl/>
-              <w:snapToGrid w:val="0"/>
-              <w:spacing w:line="276" w:lineRule="auto"/>
-              <w:jc w:val="left"/>
-              <w:rPr>
-                <w:rFonts w:ascii="Arial" w:eastAsia="KaiTi" w:hAnsi="Arial" w:cs="Arial"/>
-                <w:bCs/>
-                <w:kern w:val="0"/>
-                <w:sz w:val="20"/>
-                <w:szCs w:val="20"/>
-              </w:rPr>
-            </w:pPr>
-          </w:p>
-          <w:p>
-            <w:pPr>
-              <w:widowControl/>
-              <w:jc w:val="left"/>
-              <w:rPr>
-                <w:rFonts w:ascii="Arial" w:eastAsia="KaiTi" w:hAnsi="Arial" w:cs="Arial"/>
-                <w:kern w:val="0"/>
-                <w:sz w:val="20"/>
-                <w:szCs w:val="20"/>
-              </w:rPr>
-            </w:pPr>
-            <w:proofErr w:type="gramStart"/>
-            <w:r>
-              <w:rPr>
-                <w:rFonts w:ascii="Arial" w:eastAsia="KaiTi" w:hAnsi="Arial" w:cs="Arial"/>
-                <w:kern w:val="0"/>
-                <w:sz w:val="20"/>
-                <w:szCs w:val="20"/>
-              </w:rPr>
-              <w:t xml:space="preserve">1x1</w:t>
-            </w:r>
-          </w:p>
-          <w:p>
-            <w:pPr>
-              <w:widowControl/>
-              <w:snapToGrid w:val="0"/>
-              <w:spacing w:line="276" w:lineRule="auto"/>
-              <w:jc w:val="left"/>
-              <w:rPr>
-                <w:rFonts w:ascii="Arial" w:eastAsia="KaiTi" w:hAnsi="Arial" w:cs="Arial"/>
-                <w:b/>
-                <w:kern w:val="0"/>
-                <w:sz w:val="20"/>
-                <w:szCs w:val="20"/>
-              </w:rPr>
-            </w:pPr>
-          </w:p>
-          <w:p>
-            <w:pPr>
-              <w:widowControl/>
-              <w:snapToGrid w:val="0"/>
-              <w:spacing w:line="276" w:lineRule="auto"/>
-              <w:jc w:val="left"/>
-              <w:rPr>
-                <w:rFonts w:ascii="Arial" w:eastAsia="KaiTi" w:hAnsi="Arial" w:cs="Arial"/>
-                <w:b/>
-                <w:kern w:val="0"/>
-                <w:sz w:val="20"/>
-                <w:szCs w:val="20"/>
-              </w:rPr>
-            </w:pPr>
-            <w:proofErr w:type="gramStart"/>
-            <w:r>
-              <w:rPr>
-                <w:rFonts w:ascii="Arial" w:eastAsia="KaiTi" w:hAnsi="Arial" w:cs="Arial"/>
-                <w:kern w:val="0"/>
-                <w:sz w:val="20"/>
-                <w:szCs w:val="20"/>
-              </w:rPr>
-              <w:t xml:space="preserve">中文</w:t>
-            </w:r>
-          </w:p>
-        </w:tc>
-        <w:tc>
-          <w:tcPr>
-            <w:tcW w:w="8585" w:type="dxa"/>
-            <w:tcBorders>
-              <w:top w:val="single" w:sz="4" w:space="0" w:color="auto"/>
-              <w:left w:val="nil"/>
-              <w:bottom w:val="single" w:sz="4" w:space="0" w:color="auto"/>
-              <w:right w:val="nil"/>
-            </w:tcBorders>
-          </w:tcPr>
-          <w:p>
-            <w:pPr>
-              <w:widowControl/>
-              <w:numPr>
-                <w:ilvl w:val="0"/>
-                <w:numId w:val="1"/>
-              </w:numPr>
-              <w:snapToGrid w:val="0"/>
-              <w:spacing w:before="60" w:after="60"/>
-              <w:ind w:right="144"/>
-              <w:jc w:val="left"/>
-              <w:rPr>
-                <w:rFonts w:ascii="Arial" w:eastAsia="KaiTi" w:hAnsi="Arial" w:cs="Arial"/>
-                <w:b/>
-                <w:kern w:val="0"/>
-                <w:sz w:val="20"/>
-                <w:szCs w:val="20"/>
-              </w:rPr>
-            </w:pPr>
-            <w:r>
-              <w:rPr>
-                <w:rFonts w:ascii="Arial" w:eastAsia="KaiTi" w:hAnsi="Arial" w:cs="Arial"/>
-                <w:b/>
-                <w:kern w:val="0"/>
-                <w:sz w:val="20"/>
-                <w:szCs w:val="20"/>
-              </w:rPr>
-              <w:t xml:space="preserve">投资者类型：</w:t>
-            </w:r>
-            <w:r>
-              <w:rPr>
-                <w:rFonts w:ascii="Arial" w:eastAsia="KaiTi" w:hAnsi="Arial" w:cs="Arial"/>
-                <w:kern w:val="0"/>
-                <w:sz w:val="20"/>
-                <w:szCs w:val="20"/>
-              </w:rPr>
-              <w:t xml:space="preserve">多策略基金</w:t>
-            </w:r>
-          </w:p>
-          <w:p>
-            <w:pPr>
-              <w:widowControl/>
-              <w:numPr>
-                <w:ilvl w:val="0"/>
-                <w:numId w:val="1"/>
-              </w:numPr>
-              <w:snapToGrid w:val="0"/>
-              <w:spacing w:before="60" w:after="60"/>
-              <w:ind w:right="144"/>
-              <w:jc w:val="left"/>
-              <w:rPr>
-                <w:rFonts w:ascii="Arial" w:eastAsia="KaiTi" w:hAnsi="Arial" w:cs="Arial"/>
-                <w:b/>
-                <w:kern w:val="0"/>
-                <w:sz w:val="20"/>
-                <w:szCs w:val="20"/>
-              </w:rPr>
-            </w:pPr>
-            <w:r>
-              <w:rPr>
-                <w:rFonts w:ascii="Arial" w:eastAsia="KaiTi" w:hAnsi="Arial" w:cs="Arial"/>
-                <w:b/>
-                <w:kern w:val="0"/>
-                <w:sz w:val="20"/>
-                <w:szCs w:val="20"/>
-              </w:rPr>
-              <w:t xml:space="preserve">资产管理规模：</w:t>
-            </w:r>
-            <w:r>
-              <w:rPr>
-                <w:rFonts w:ascii="Arial" w:eastAsia="KaiTi" w:hAnsi="Arial" w:cs="Arial"/>
-                <w:kern w:val="0"/>
-                <w:sz w:val="20"/>
-                <w:szCs w:val="20"/>
-              </w:rPr>
-              <w:t xml:space="preserve">3.1亿美元</w:t>
-            </w:r>
-          </w:p>
-          <w:p>
-            <w:pPr>
-              <w:widowControl/>
-              <w:numPr>
-                <w:ilvl w:val="0"/>
-                <w:numId w:val="1"/>
-              </w:numPr>
-              <w:snapToGrid w:val="0"/>
-              <w:spacing w:before="60" w:after="60"/>
-              <w:ind w:right="144"/>
-              <w:jc w:val="left"/>
-              <w:rPr>
-                <w:rFonts w:ascii="Arial" w:eastAsia="KaiTi" w:hAnsi="Arial" w:cs="Arial"/>
-                <w:b/>
-                <w:kern w:val="0"/>
-                <w:sz w:val="20"/>
-                <w:szCs w:val="20"/>
-              </w:rPr>
-            </w:pPr>
-            <w:r>
-              <w:rPr>
-                <w:rFonts w:ascii="Arial" w:eastAsia="KaiTi" w:hAnsi="Arial" w:cs="Arial"/>
-                <w:b/>
-                <w:kern w:val="0"/>
-                <w:sz w:val="20"/>
-                <w:szCs w:val="20"/>
-              </w:rPr>
-              <w:t xml:space="preserve">参会人：</w:t>
-            </w:r>
-            <w:r>
-              <w:rPr>
-                <w:rFonts w:ascii="Arial" w:eastAsia="KaiTi" w:hAnsi="Arial" w:cs="Arial"/>
-                <w:kern w:val="0"/>
-                <w:sz w:val="20"/>
-                <w:szCs w:val="20"/>
-              </w:rPr>
-              <w:t xml:space="preserve">Edgar Hu （基金经理）</w:t>
-              <w:br/>
-              <w:t xml:space="preserve">文博（高级分析师）</w:t>
-              <w:br/>
-              <w:t xml:space="preserve">Phoebe Guo（基金经理）</w:t>
-            </w:r>
-          </w:p>
-          <w:p>
-            <w:pPr>
-              <w:widowControl/>
-              <w:numPr>
-                <w:ilvl w:val="0"/>
-                <w:numId w:val="1"/>
-              </w:numPr>
-              <w:snapToGrid w:val="0"/>
-              <w:spacing w:before="60" w:after="60"/>
-              <w:ind w:right="144"/>
-              <w:jc w:val="left"/>
-              <w:rPr>
-                <w:rFonts w:ascii="Arial" w:eastAsia="KaiTi" w:hAnsi="Arial" w:cs="Arial"/>
-                <w:b/>
-                <w:kern w:val="0"/>
-                <w:sz w:val="20"/>
-                <w:szCs w:val="20"/>
-              </w:rPr>
-            </w:pPr>
-            <w:r>
-              <w:rPr>
-                <w:rFonts w:ascii="Arial" w:eastAsia="KaiTi" w:hAnsi="Arial" w:cs="Arial"/>
-                <w:b/>
-                <w:kern w:val="0"/>
-                <w:sz w:val="20"/>
-                <w:szCs w:val="20"/>
-              </w:rPr>
-              <w:t>负责投行：</w:t>
-            </w:r>
-            <w:r>
-              <w:rPr>
-                <w:rFonts w:ascii="KaiTi" w:eastAsia="KaiTi" w:hAnsi="KaiTi"/>
-                <w:sz w:val="20"/>
-                <w:szCs w:val="20"/>
-              </w:rPr>
-              <w:t>招证国际</w:t>
-            </w:r>
-          </w:p>
-          <w:p>
-            <w:pPr>
-              <w:widowControl/>
-              <w:numPr>
-                <w:ilvl w:val="0"/>
-                <w:numId w:val="1"/>
-              </w:numPr>
-              <w:snapToGrid w:val="0"/>
-              <w:spacing w:before="60" w:after="60"/>
-              <w:ind w:right="144"/>
-              <w:jc w:val="left"/>
-              <w:rPr>
-                <w:rFonts w:ascii="Arial" w:eastAsia="KaiTi" w:hAnsi="Arial" w:cs="Arial"/>
-                <w:b/>
-                <w:kern w:val="0"/>
-                <w:sz w:val="20"/>
-                <w:szCs w:val="20"/>
-              </w:rPr>
-            </w:pPr>
-            <w:r>
-              <w:rPr>
-                <w:rFonts w:ascii="Arial" w:eastAsia="KaiTi" w:hAnsi="Arial" w:cs="Arial"/>
-                <w:b/>
-                <w:kern w:val="0"/>
-                <w:sz w:val="20"/>
-                <w:szCs w:val="20"/>
-              </w:rPr>
-              <w:t xml:space="preserve">投资者简介：</w:t>
-            </w:r>
-          </w:p>
-          <w:p>
-            <w:pPr>
-              <w:pStyle w:val="ListParagraph"/>
-              <w:widowControl/>
-              <w:numPr>
-                <w:ilvl w:val="0"/>
-                <w:numId w:val="4"/>
-              </w:numPr>
-              <w:snapToGrid w:val="0"/>
-              <w:spacing w:before="60" w:after="60"/>
-              <w:ind w:right="144"/>
-              <w:jc w:val="left"/>
-              <w:rPr>
-                <w:rFonts w:ascii="Arial" w:eastAsia="KaiTi" w:hAnsi="Arial" w:cs="Arial"/>
-                <w:b/>
-                <w:kern w:val="0"/>
-                <w:sz w:val="20"/>
-                <w:szCs w:val="20"/>
-              </w:rPr>
-            </w:pPr>
-            <w:proofErr w:type="gramStart"/>
-            <w:r>
-              <w:rPr>
-                <w:rFonts w:ascii="Arial" w:eastAsia="KaiTi" w:hAnsi="Arial" w:cs="Arial"/>
-                <w:kern w:val="0"/>
-                <w:sz w:val="20"/>
-                <w:szCs w:val="20"/>
-              </w:rPr>
-              <w:t xml:space="preserve">Jump Trading成立于 1999年，是一家专注于算法交易和高频交易策略的专营交易公司，活跃于全球期货、期权、加密货币和股票市场。研究人员、工程师和交易员并肩工作，将想法从概念转化为实际产品，兼具科学思维和快速、专注的迭代效率。公司的机器学习和人工智能专家直接与交易团队合作，专注于特定市场。Jump Trading积极关注港股市场投资机会，近期频繁参与A to H上市项目的基石投资，其重点布局领域包括消费与 TMT 赛道。</w:t>
-            </w:r>
-            <w:r>
-              <w:rPr>
-                <w:rFonts w:ascii="Arial" w:eastAsia="KaiTi" w:hAnsi="Arial" w:cs="Arial"/>
-                <w:kern w:val="0"/>
-                <w:sz w:val="20"/>
-                <w:szCs w:val="20"/>
-              </w:rPr>
-              <w:t xml:space="preserve"/>
-            </w:r>
-          </w:p>
-          <w:p>
-            <w:pPr>
-              <w:pStyle w:val="ListParagraph"/>
-              <w:widowControl/>
-              <w:numPr>
-                <w:ilvl w:val="0"/>
-                <w:numId w:val="4"/>
-              </w:numPr>
-              <w:snapToGrid w:val="0"/>
-              <w:spacing w:before="60" w:after="60"/>
-              <w:ind w:right="144"/>
-              <w:jc w:val="left"/>
-              <w:rPr>
-                <w:rFonts w:ascii="Arial" w:eastAsia="KaiTi" w:hAnsi="Arial" w:cs="Arial"/>
-                <w:b/>
-                <w:kern w:val="0"/>
-                <w:sz w:val="20"/>
-                <w:szCs w:val="20"/>
-              </w:rPr>
-            </w:pPr>
-            <w:r>
-              <w:rPr>
-                <w:rFonts w:ascii="Arial" w:eastAsia="KaiTi" w:hAnsi="Arial" w:cs="Arial"/>
-                <w:kern w:val="0"/>
-                <w:sz w:val="20"/>
-                <w:szCs w:val="20"/>
-              </w:rPr>
-              <w:t xml:space="preserve">过往港股基石投资案例：</w:t>
-            </w:r>
-            <w:r>
-              <w:rPr>
-                <w:rFonts w:ascii="Arial" w:eastAsia="KaiTi" w:hAnsi="Arial" w:cs="Arial"/>
-                <w:kern w:val="0"/>
-                <w:sz w:val="20"/>
-                <w:szCs w:val="20"/>
-              </w:rPr>
-              <w:t xml:space="preserve">胜宏科技、兆威机电、沃尔核材、均胜电子、赛力斯、周六福、美的集团</w:t>
+              <w:t xml:space="preserve">奥克斯电气、大族数控、东软教育等</w:t>
             </w:r>
             <w:r>
               <w:rPr>
@@ -9778,7 +10650,7 @@
         <w:rPr>
           <w:rFonts w:ascii="Arial" w:eastAsia="KaiTi" w:hAnsi="Arial" w:cs="Arial"/>
           <w:b/>
-          <w:color w:val="002060"/>
+          <w:color w:val="FF9300"/>
           <w:kern w:val="0"/>
           <w:sz w:val="28"/>
           <w:szCs w:val="24"/>
@@ -9812,1716 +10684,7 @@
           <w:tcPr>
             <w:tcW w:w="10912" w:type="dxa"/>
             <w:gridSpan w:val="2"/>
-            <w:shd w:val="clear" w:color="auto" w:fill="002060"/>
-            <w:vAlign w:val="center"/>
-          </w:tcPr>
-          <w:p>
-            <w:pPr>
-              <w:keepNext/>
-              <w:widowControl/>
-              <w:snapToGrid w:val="0"/>
-              <w:spacing w:before="40" w:after="40"/>
-              <w:ind w:right="144"/>
-              <w:jc w:val="center"/>
-              <w:rPr>
-                <w:rFonts w:ascii="Arial" w:eastAsia="KaiTi" w:hAnsi="Arial" w:cs="Arial"/>
-                <w:b/>
-                <w:color w:val="FFFFFF"/>
-                <w:sz w:val="24"/>
-                <w:szCs w:val="24"/>
-              </w:rPr>
-            </w:pPr>
-            <w:r>
-              <w:rPr>
-                <w:rFonts w:ascii="KaiTi" w:eastAsia="KaiTi" w:hAnsi="KaiTi" w:cs="Arial"/>
-                <w:b/>
-                <w:color w:val="FFFFFF"/>
-                <w:sz w:val="24"/>
-                <w:szCs w:val="24"/>
-              </w:rPr>
-              <w:t xml:space="preserve">6月20日（周六）</w:t>
-            </w:r>
-            <w:r>
-              <w:rPr>
-                <w:rFonts w:ascii="Arial" w:eastAsia="KaiTi" w:hAnsi="Arial" w:cs="Arial"/>
-                <w:b/>
-                <w:color w:val="FFFFFF"/>
-                <w:kern w:val="0"/>
-                <w:sz w:val="24"/>
-                <w:szCs w:val="24"/>
-              </w:rPr>
-              <w:t xml:space="preserve">| </w:t>
-            </w:r>
-            <w:r>
-              <w:rPr>
-                <w:rFonts w:ascii="KaiTi" w:eastAsia="KaiTi" w:hAnsi="KaiTi" w:cs="Arial"/>
-                <w:b/>
-                <w:color w:val="FFFFFF"/>
-                <w:sz w:val="24"/>
-                <w:szCs w:val="24"/>
-              </w:rPr>
-              <w:t xml:space="preserve">上海</w:t>
-            </w:r>
-          </w:p>
-        </w:tc>
-      </w:tr>
-      <w:tr>
-        <w:trPr>
-          <w:trHeight w:val="260"/>
-          <w:jc w:val="center"/>
-        </w:trPr>
-        <w:tc>
-          <w:tcPr>
-            <w:tcW w:w="2327" w:type="dxa"/>
-            <w:tcBorders>
-              <w:left w:val="nil"/>
-              <w:bottom w:val="single" w:sz="4" w:space="0" w:color="auto"/>
-              <w:right w:val="nil"/>
-            </w:tcBorders>
-            <w:vAlign w:val="center"/>
-          </w:tcPr>
-          <w:p>
-            <w:pPr>
-              <w:widowControl/>
-              <w:snapToGrid w:val="0"/>
-              <w:spacing w:before="60" w:after="60"/>
-              <w:ind w:right="144"/>
-              <w:jc w:val="left"/>
-              <w:rPr>
-                <w:rFonts w:ascii="Arial" w:eastAsia="KaiTi" w:hAnsi="Arial" w:cs="Arial"/>
-                <w:b/>
-                <w:bCs/>
-                <w:kern w:val="0"/>
-                <w:szCs w:val="21"/>
-              </w:rPr>
-            </w:pPr>
-            <w:r>
-              <w:rPr>
-                <w:rFonts w:ascii="Arial" w:eastAsia="KaiTi" w:hAnsi="Arial" w:cs="Arial"/>
-                <w:b/>
-                <w:bCs/>
-                <w:kern w:val="0"/>
-                <w:szCs w:val="21"/>
-              </w:rPr>
-              <w:t>投资者</w:t>
-            </w:r>
-          </w:p>
-        </w:tc>
-        <w:tc>
-          <w:tcPr>
-            <w:tcW w:w="8585" w:type="dxa"/>
-            <w:tcBorders>
-              <w:left w:val="nil"/>
-              <w:bottom w:val="single" w:sz="4" w:space="0" w:color="auto"/>
-              <w:right w:val="nil"/>
-            </w:tcBorders>
-            <w:vAlign w:val="center"/>
-          </w:tcPr>
-          <w:p>
-            <w:pPr>
-              <w:widowControl/>
-              <w:snapToGrid w:val="0"/>
-              <w:spacing w:before="60" w:after="60"/>
-              <w:ind w:right="144"/>
-              <w:jc w:val="left"/>
-              <w:rPr>
-                <w:rFonts w:ascii="Arial" w:eastAsia="KaiTi" w:hAnsi="Arial" w:cs="Arial"/>
-                <w:b/>
-                <w:kern w:val="0"/>
-                <w:szCs w:val="21"/>
-              </w:rPr>
-            </w:pPr>
-            <w:r>
-              <w:rPr>
-                <w:rFonts w:ascii="Arial" w:eastAsia="KaiTi" w:hAnsi="Arial" w:cs="Arial"/>
-                <w:b/>
-                <w:kern w:val="0"/>
-                <w:szCs w:val="21"/>
-              </w:rPr>
-              <w:t xml:space="preserve">介绍</w:t>
-            </w:r>
-          </w:p>
-        </w:tc>
-      </w:tr>
-      <w:tr>
-        <w:trPr>
-          <w:jc w:val="center"/>
-        </w:trPr>
-        <w:tc>
-          <w:tcPr>
-            <w:tcW w:w="2327" w:type="dxa"/>
-            <w:tcBorders>
-              <w:top w:val="single" w:sz="4" w:space="0" w:color="auto"/>
-              <w:left w:val="nil"/>
-              <w:bottom w:val="single" w:sz="4" w:space="0" w:color="auto"/>
-              <w:right w:val="nil"/>
-            </w:tcBorders>
-          </w:tcPr>
-          <w:p>
-            <w:pPr>
-              <w:widowControl/>
-              <w:jc w:val="left"/>
-              <w:rPr>
-                <w:rFonts w:ascii="Arial" w:eastAsia="KaiTi" w:hAnsi="Arial" w:cs="Arial"/>
-                <w:color w:val="000000"/>
-                <w:kern w:val="0"/>
-                <w:sz w:val="20"/>
-                <w:szCs w:val="20"/>
-              </w:rPr>
-            </w:pPr>
-            <w:r>
-              <w:rPr>
-                <w:rFonts w:ascii="Arial" w:eastAsia="KaiTi" w:hAnsi="Arial" w:cs="Arial"/>
-                <w:color w:val="000000"/>
-                <w:kern w:val="0"/>
-                <w:sz w:val="20"/>
-                <w:szCs w:val="20"/>
-              </w:rPr>
-              <w:t xml:space="preserve"/>
-            </w:r>
-            <w:r>
-              <w:rPr>
-                <w:rFonts w:ascii="Arial" w:eastAsia="KaiTi" w:hAnsi="Arial" w:cs="Arial"/>
-                <w:b/>
-                <w:color w:val="000000"/>
-                <w:kern w:val="0"/>
-                <w:sz w:val="20"/>
-                <w:szCs w:val="20"/>
-              </w:rPr>
-              <w:t xml:space="preserve">Hudson River Trading</w:t>
-            </w:r>
-          </w:p>
-          <w:p>
-            <w:pPr>
-              <w:widowControl/>
-              <w:snapToGrid w:val="0"/>
-              <w:spacing w:line="276" w:lineRule="auto"/>
-              <w:jc w:val="left"/>
-              <w:rPr>
-                <w:rFonts w:ascii="Arial" w:eastAsia="KaiTi" w:hAnsi="Arial" w:cs="Arial"/>
-                <w:b/>
-                <w:bCs/>
-                <w:kern w:val="0"/>
-                <w:sz w:val="20"/>
-                <w:szCs w:val="20"/>
-              </w:rPr>
-            </w:pPr>
-          </w:p>
-          <w:p>
-            <w:pPr>
-              <w:widowControl/>
-              <w:snapToGrid w:val="0"/>
-              <w:spacing w:line="276" w:lineRule="auto"/>
-              <w:jc w:val="left"/>
-              <w:rPr>
-                <w:rFonts w:ascii="Arial" w:eastAsia="KaiTi" w:hAnsi="Arial" w:cs="Arial"/>
-                <w:b/>
-                <w:kern w:val="0"/>
-                <w:sz w:val="20"/>
-                <w:szCs w:val="20"/>
-              </w:rPr>
-            </w:pPr>
-            <w:r>
-              <w:rPr>
-                <w:rFonts w:ascii="Arial" w:eastAsia="KaiTi" w:hAnsi="Arial" w:cs="Arial"/>
-                <w:b/>
-                <w:kern w:val="0"/>
-                <w:sz w:val="20"/>
-                <w:szCs w:val="20"/>
-              </w:rPr>
-              <w:t>会议时间</w:t>
-            </w:r>
-            <w:r>
-              <w:rPr>
-                <w:rFonts w:ascii="Arial" w:eastAsia="KaiTi" w:hAnsi="Arial" w:cs="Arial"/>
-                <w:b/>
-                <w:kern w:val="0"/>
-                <w:sz w:val="20"/>
-                <w:szCs w:val="20"/>
-              </w:rPr>
-              <w:t xml:space="preserve">:</w:t>
-            </w:r>
-          </w:p>
-          <w:p>
-            <w:pPr>
-              <w:widowControl/>
-              <w:snapToGrid w:val="0"/>
-              <w:spacing w:line="276" w:lineRule="auto"/>
-              <w:jc w:val="left"/>
-              <w:rPr>
-                <w:rFonts w:ascii="Arial" w:eastAsia="KaiTi" w:hAnsi="Arial" w:cs="Arial"/>
-                <w:kern w:val="0"/>
-                <w:sz w:val="20"/>
-                <w:szCs w:val="20"/>
-              </w:rPr>
-            </w:pPr>
-            <w:proofErr w:type="gramStart"/>
-            <w:r>
-              <w:rPr>
-                <w:rFonts w:ascii="Arial" w:eastAsia="KaiTi" w:hAnsi="Arial" w:cs="Arial"/>
-                <w:kern w:val="0"/>
-                <w:sz w:val="20"/>
-                <w:szCs w:val="20"/>
-              </w:rPr>
-              <w:t xml:space="preserve">14:00-15:00</w:t>
-            </w:r>
-          </w:p>
-          <w:p>
-            <w:pPr>
-              <w:widowControl/>
-              <w:snapToGrid w:val="0"/>
-              <w:spacing w:line="276" w:lineRule="auto"/>
-              <w:jc w:val="left"/>
-              <w:rPr>
-                <w:rFonts w:ascii="Arial" w:eastAsia="KaiTi" w:hAnsi="Arial" w:cs="Arial"/>
-                <w:bCs/>
-                <w:kern w:val="0"/>
-                <w:sz w:val="20"/>
-                <w:szCs w:val="20"/>
-              </w:rPr>
-            </w:pPr>
-            <w:r>
-              <w:rPr>
-                <w:rFonts w:ascii="Arial" w:eastAsia="KaiTi" w:hAnsi="Arial" w:cs="Arial"/>
-                <w:bCs/>
-                <w:kern w:val="0"/>
-                <w:sz w:val="20"/>
-                <w:szCs w:val="20"/>
-              </w:rPr>
-              <w:t xml:space="preserve">本地时间</w:t>
-            </w:r>
-          </w:p>
-          <w:p>
-            <w:pPr>
-              <w:widowControl/>
-              <w:snapToGrid w:val="0"/>
-              <w:spacing w:line="276" w:lineRule="auto"/>
-              <w:jc w:val="left"/>
-              <w:rPr>
-                <w:rFonts w:ascii="Arial" w:eastAsia="KaiTi" w:hAnsi="Arial" w:cs="Arial"/>
-                <w:bCs/>
-                <w:kern w:val="0"/>
-                <w:sz w:val="20"/>
-                <w:szCs w:val="20"/>
-              </w:rPr>
-            </w:pPr>
-          </w:p>
-          <w:p>
-            <w:pPr>
-              <w:widowControl/>
-              <w:jc w:val="left"/>
-              <w:rPr>
-                <w:rFonts w:ascii="Arial" w:eastAsia="KaiTi" w:hAnsi="Arial" w:cs="Arial"/>
-                <w:kern w:val="0"/>
-                <w:sz w:val="20"/>
-                <w:szCs w:val="20"/>
-              </w:rPr>
-            </w:pPr>
-            <w:proofErr w:type="gramStart"/>
-            <w:r>
-              <w:rPr>
-                <w:rFonts w:ascii="Arial" w:eastAsia="KaiTi" w:hAnsi="Arial" w:cs="Arial"/>
-                <w:kern w:val="0"/>
-                <w:sz w:val="20"/>
-                <w:szCs w:val="20"/>
-              </w:rPr>
-              <w:t xml:space="preserve">小组会</w:t>
-            </w:r>
-          </w:p>
-          <w:p>
-            <w:pPr>
-              <w:widowControl/>
-              <w:snapToGrid w:val="0"/>
-              <w:spacing w:line="276" w:lineRule="auto"/>
-              <w:jc w:val="left"/>
-              <w:rPr>
-                <w:rFonts w:ascii="Arial" w:eastAsia="KaiTi" w:hAnsi="Arial" w:cs="Arial"/>
-                <w:b/>
-                <w:kern w:val="0"/>
-                <w:sz w:val="20"/>
-                <w:szCs w:val="20"/>
-              </w:rPr>
-            </w:pPr>
-          </w:p>
-          <w:p>
-            <w:pPr>
-              <w:widowControl/>
-              <w:snapToGrid w:val="0"/>
-              <w:spacing w:line="276" w:lineRule="auto"/>
-              <w:jc w:val="left"/>
-              <w:rPr>
-                <w:rFonts w:ascii="Arial" w:eastAsia="KaiTi" w:hAnsi="Arial" w:cs="Arial"/>
-                <w:b/>
-                <w:kern w:val="0"/>
-                <w:sz w:val="20"/>
-                <w:szCs w:val="20"/>
-              </w:rPr>
-            </w:pPr>
-            <w:proofErr w:type="gramStart"/>
-            <w:r>
-              <w:rPr>
-                <w:rFonts w:ascii="Arial" w:eastAsia="KaiTi" w:hAnsi="Arial" w:cs="Arial"/>
-                <w:kern w:val="0"/>
-                <w:sz w:val="20"/>
-                <w:szCs w:val="20"/>
-              </w:rPr>
-              <w:t xml:space="preserve">中文</w:t>
-            </w:r>
-          </w:p>
-        </w:tc>
-        <w:tc>
-          <w:tcPr>
-            <w:tcW w:w="8585" w:type="dxa"/>
-            <w:tcBorders>
-              <w:top w:val="single" w:sz="4" w:space="0" w:color="auto"/>
-              <w:left w:val="nil"/>
-              <w:bottom w:val="single" w:sz="4" w:space="0" w:color="auto"/>
-              <w:right w:val="nil"/>
-            </w:tcBorders>
-          </w:tcPr>
-          <w:p>
-            <w:pPr>
-              <w:widowControl/>
-              <w:numPr>
-                <w:ilvl w:val="0"/>
-                <w:numId w:val="1"/>
-              </w:numPr>
-              <w:snapToGrid w:val="0"/>
-              <w:spacing w:before="60" w:after="60"/>
-              <w:ind w:right="144"/>
-              <w:jc w:val="left"/>
-              <w:rPr>
-                <w:rFonts w:ascii="Arial" w:eastAsia="KaiTi" w:hAnsi="Arial" w:cs="Arial"/>
-                <w:b/>
-                <w:kern w:val="0"/>
-                <w:sz w:val="20"/>
-                <w:szCs w:val="20"/>
-              </w:rPr>
-            </w:pPr>
-            <w:r>
-              <w:rPr>
-                <w:rFonts w:ascii="Arial" w:eastAsia="KaiTi" w:hAnsi="Arial" w:cs="Arial"/>
-                <w:b/>
-                <w:kern w:val="0"/>
-                <w:sz w:val="20"/>
-                <w:szCs w:val="20"/>
-              </w:rPr>
-              <w:t xml:space="preserve">投资者类型：</w:t>
-            </w:r>
-            <w:r>
-              <w:rPr>
-                <w:rFonts w:ascii="Arial" w:eastAsia="KaiTi" w:hAnsi="Arial" w:cs="Arial"/>
-                <w:kern w:val="0"/>
-                <w:sz w:val="20"/>
-                <w:szCs w:val="20"/>
-              </w:rPr>
-              <w:t xml:space="preserve">多策略基金</w:t>
-            </w:r>
-          </w:p>
-          <w:p>
-            <w:pPr>
-              <w:widowControl/>
-              <w:numPr>
-                <w:ilvl w:val="0"/>
-                <w:numId w:val="1"/>
-              </w:numPr>
-              <w:snapToGrid w:val="0"/>
-              <w:spacing w:before="60" w:after="60"/>
-              <w:ind w:right="144"/>
-              <w:jc w:val="left"/>
-              <w:rPr>
-                <w:rFonts w:ascii="Arial" w:eastAsia="KaiTi" w:hAnsi="Arial" w:cs="Arial"/>
-                <w:b/>
-                <w:kern w:val="0"/>
-                <w:sz w:val="20"/>
-                <w:szCs w:val="20"/>
-              </w:rPr>
-            </w:pPr>
-            <w:r>
-              <w:rPr>
-                <w:rFonts w:ascii="Arial" w:eastAsia="KaiTi" w:hAnsi="Arial" w:cs="Arial"/>
-                <w:b/>
-                <w:kern w:val="0"/>
-                <w:sz w:val="20"/>
-                <w:szCs w:val="20"/>
-              </w:rPr>
-              <w:t xml:space="preserve">资产管理规模：</w:t>
-            </w:r>
-            <w:r>
-              <w:rPr>
-                <w:rFonts w:ascii="Arial" w:eastAsia="KaiTi" w:hAnsi="Arial" w:cs="Arial"/>
-                <w:kern w:val="0"/>
-                <w:sz w:val="20"/>
-                <w:szCs w:val="20"/>
-              </w:rPr>
-              <w:t xml:space="preserve">超12亿美元</w:t>
-            </w:r>
-          </w:p>
-          <w:p>
-            <w:pPr>
-              <w:widowControl/>
-              <w:numPr>
-                <w:ilvl w:val="0"/>
-                <w:numId w:val="1"/>
-              </w:numPr>
-              <w:snapToGrid w:val="0"/>
-              <w:spacing w:before="60" w:after="60"/>
-              <w:ind w:right="144"/>
-              <w:jc w:val="left"/>
-              <w:rPr>
-                <w:rFonts w:ascii="Arial" w:eastAsia="KaiTi" w:hAnsi="Arial" w:cs="Arial"/>
-                <w:b/>
-                <w:kern w:val="0"/>
-                <w:sz w:val="20"/>
-                <w:szCs w:val="20"/>
-              </w:rPr>
-            </w:pPr>
-            <w:r>
-              <w:rPr>
-                <w:rFonts w:ascii="Arial" w:eastAsia="KaiTi" w:hAnsi="Arial" w:cs="Arial"/>
-                <w:b/>
-                <w:kern w:val="0"/>
-                <w:sz w:val="20"/>
-                <w:szCs w:val="20"/>
-              </w:rPr>
-              <w:t xml:space="preserve">参会人：</w:t>
-            </w:r>
-            <w:r>
-              <w:rPr>
-                <w:rFonts w:ascii="Arial" w:eastAsia="KaiTi" w:hAnsi="Arial" w:cs="Arial"/>
-                <w:kern w:val="0"/>
-                <w:sz w:val="20"/>
-                <w:szCs w:val="20"/>
-              </w:rPr>
-              <w:t xml:space="preserve">Toh Zhen Zhou（基金经理）</w:t>
-            </w:r>
-          </w:p>
-          <w:p>
-            <w:pPr>
-              <w:widowControl/>
-              <w:numPr>
-                <w:ilvl w:val="0"/>
-                <w:numId w:val="1"/>
-              </w:numPr>
-              <w:snapToGrid w:val="0"/>
-              <w:spacing w:before="60" w:after="60"/>
-              <w:ind w:right="144"/>
-              <w:jc w:val="left"/>
-              <w:rPr>
-                <w:rFonts w:ascii="Arial" w:eastAsia="KaiTi" w:hAnsi="Arial" w:cs="Arial"/>
-                <w:b/>
-                <w:kern w:val="0"/>
-                <w:sz w:val="20"/>
-                <w:szCs w:val="20"/>
-              </w:rPr>
-            </w:pPr>
-            <w:r>
-              <w:rPr>
-                <w:rFonts w:ascii="Arial" w:eastAsia="KaiTi" w:hAnsi="Arial" w:cs="Arial"/>
-                <w:b/>
-                <w:kern w:val="0"/>
-                <w:sz w:val="20"/>
-                <w:szCs w:val="20"/>
-              </w:rPr>
-              <w:t>负责投行：</w:t>
-            </w:r>
-            <w:r>
-              <w:rPr>
-                <w:rFonts w:ascii="KaiTi" w:eastAsia="KaiTi" w:hAnsi="KaiTi"/>
-                <w:sz w:val="20"/>
-                <w:szCs w:val="20"/>
-              </w:rPr>
-              <w:t>招证国际</w:t>
-            </w:r>
-          </w:p>
-          <w:p>
-            <w:pPr>
-              <w:widowControl/>
-              <w:numPr>
-                <w:ilvl w:val="0"/>
-                <w:numId w:val="1"/>
-              </w:numPr>
-              <w:snapToGrid w:val="0"/>
-              <w:spacing w:before="60" w:after="60"/>
-              <w:ind w:right="144"/>
-              <w:jc w:val="left"/>
-              <w:rPr>
-                <w:rFonts w:ascii="Arial" w:eastAsia="KaiTi" w:hAnsi="Arial" w:cs="Arial"/>
-                <w:b/>
-                <w:kern w:val="0"/>
-                <w:sz w:val="20"/>
-                <w:szCs w:val="20"/>
-              </w:rPr>
-            </w:pPr>
-            <w:r>
-              <w:rPr>
-                <w:rFonts w:ascii="Arial" w:eastAsia="KaiTi" w:hAnsi="Arial" w:cs="Arial"/>
-                <w:b/>
-                <w:kern w:val="0"/>
-                <w:sz w:val="20"/>
-                <w:szCs w:val="20"/>
-              </w:rPr>
-              <w:t xml:space="preserve">投资者简介：</w:t>
-            </w:r>
-          </w:p>
-          <w:p>
-            <w:pPr>
-              <w:pStyle w:val="ListParagraph"/>
-              <w:widowControl/>
-              <w:numPr>
-                <w:ilvl w:val="0"/>
-                <w:numId w:val="4"/>
-              </w:numPr>
-              <w:snapToGrid w:val="0"/>
-              <w:spacing w:before="60" w:after="60"/>
-              <w:ind w:right="144"/>
-              <w:jc w:val="left"/>
-              <w:rPr>
-                <w:rFonts w:ascii="Arial" w:eastAsia="KaiTi" w:hAnsi="Arial" w:cs="Arial"/>
-                <w:b/>
-                <w:kern w:val="0"/>
-                <w:sz w:val="20"/>
-                <w:szCs w:val="20"/>
-              </w:rPr>
-            </w:pPr>
-            <w:proofErr w:type="gramStart"/>
-            <w:r>
-              <w:rPr>
-                <w:rFonts w:ascii="Arial" w:eastAsia="KaiTi" w:hAnsi="Arial" w:cs="Arial"/>
-                <w:kern w:val="0"/>
-                <w:sz w:val="20"/>
-                <w:szCs w:val="20"/>
-              </w:rPr>
-              <w:t xml:space="preserve">Hudson River Trading是一家成立于2002年、总部位于纽约的全球性量化交易与做市商。HRT由一群来自哈佛和MIT、拥有计算机科学和数学背景的合伙人创办，创始之初便希望通过技术手段彻底改变当时由人工主导的交易市场。经过二十余年的发展，HRT已从最初的美国股票市场拓展至全球几乎所有电子交易市场，并成长为与简街（Jane Street）、城堡证券（Citadel Securities）齐名的华尔街顶级量化交易机构</w:t>
-            </w:r>
-            <w:r>
-              <w:rPr>
-                <w:rFonts w:ascii="Arial" w:eastAsia="KaiTi" w:hAnsi="Arial" w:cs="Arial"/>
-                <w:kern w:val="0"/>
-                <w:sz w:val="20"/>
-                <w:szCs w:val="20"/>
-              </w:rPr>
-              <w:t xml:space="preserve"/>
-            </w:r>
-          </w:p>
-        </w:tc>
-      </w:tr>
-      <w:tr>
-        <w:trPr>
-          <w:jc w:val="center"/>
-        </w:trPr>
-        <w:tc>
-          <w:tcPr>
-            <w:tcW w:w="2327" w:type="dxa"/>
-            <w:tcBorders>
-              <w:top w:val="single" w:sz="4" w:space="0" w:color="auto"/>
-              <w:left w:val="nil"/>
-              <w:bottom w:val="single" w:sz="4" w:space="0" w:color="auto"/>
-              <w:right w:val="nil"/>
-            </w:tcBorders>
-          </w:tcPr>
-          <w:p>
-            <w:pPr>
-              <w:widowControl/>
-              <w:jc w:val="left"/>
-              <w:rPr>
-                <w:rFonts w:ascii="Arial" w:eastAsia="KaiTi" w:hAnsi="Arial" w:cs="Arial"/>
-                <w:sz w:val="20"/>
-                <w:szCs w:val="20"/>
-              </w:rPr>
-            </w:pPr>
-            <w:r>
-              <w:rPr>
-                <w:rFonts w:ascii="Arial" w:eastAsia="KaiTi" w:hAnsi="Arial" w:cs="Arial"/>
-                <w:sz w:val="20"/>
-                <w:szCs w:val="20"/>
-              </w:rPr>
-              <w:t xml:space="preserve"/>
-            </w:r>
-            <w:r>
-              <w:rPr>
-                <w:rFonts w:ascii="Arial" w:eastAsia="KaiTi" w:hAnsi="Arial" w:cs="Arial"/>
-                <w:b/>
-                <w:color w:val="000000"/>
-                <w:kern w:val="0"/>
-                <w:sz w:val="20"/>
-                <w:szCs w:val="20"/>
-              </w:rPr>
-              <w:t xml:space="preserve">JPM AM</w:t>
-              <w:br/>
-              <w:t xml:space="preserve">JP摩根资管</w:t>
-            </w:r>
-          </w:p>
-          <w:p>
-            <w:pPr>
-              <w:widowControl/>
-              <w:snapToGrid w:val="0"/>
-              <w:spacing w:line="276" w:lineRule="auto"/>
-              <w:jc w:val="left"/>
-              <w:rPr>
-                <w:rFonts w:ascii="Arial" w:eastAsia="KaiTi" w:hAnsi="Arial" w:cs="Arial"/>
-                <w:b/>
-                <w:bCs/>
-                <w:kern w:val="0"/>
-                <w:sz w:val="20"/>
-                <w:szCs w:val="20"/>
-              </w:rPr>
-            </w:pPr>
-          </w:p>
-          <w:p>
-            <w:pPr>
-              <w:widowControl/>
-              <w:snapToGrid w:val="0"/>
-              <w:spacing w:line="276" w:lineRule="auto"/>
-              <w:jc w:val="left"/>
-              <w:rPr>
-                <w:rFonts w:ascii="Arial" w:eastAsia="KaiTi" w:hAnsi="Arial" w:cs="Arial"/>
-                <w:b/>
-                <w:kern w:val="0"/>
-                <w:sz w:val="20"/>
-                <w:szCs w:val="20"/>
-              </w:rPr>
-            </w:pPr>
-            <w:r>
-              <w:rPr>
-                <w:rFonts w:ascii="Arial" w:eastAsia="KaiTi" w:hAnsi="Arial" w:cs="Arial"/>
-                <w:b/>
-                <w:kern w:val="0"/>
-                <w:sz w:val="20"/>
-                <w:szCs w:val="20"/>
-              </w:rPr>
-              <w:t>会议时间</w:t>
-            </w:r>
-            <w:r>
-              <w:rPr>
-                <w:rFonts w:ascii="Arial" w:eastAsia="KaiTi" w:hAnsi="Arial" w:cs="Arial"/>
-                <w:b/>
-                <w:kern w:val="0"/>
-                <w:sz w:val="20"/>
-                <w:szCs w:val="20"/>
-              </w:rPr>
-              <w:t xml:space="preserve">:</w:t>
-            </w:r>
-          </w:p>
-          <w:p>
-            <w:pPr>
-              <w:widowControl/>
-              <w:snapToGrid w:val="0"/>
-              <w:spacing w:line="276" w:lineRule="auto"/>
-              <w:jc w:val="left"/>
-              <w:rPr>
-                <w:rFonts w:ascii="Arial" w:eastAsia="KaiTi" w:hAnsi="Arial" w:cs="Arial"/>
-                <w:kern w:val="0"/>
-                <w:sz w:val="20"/>
-                <w:szCs w:val="20"/>
-              </w:rPr>
-            </w:pPr>
-            <w:proofErr w:type="gramStart"/>
-            <w:r>
-              <w:rPr>
-                <w:rFonts w:ascii="Arial" w:eastAsia="KaiTi" w:hAnsi="Arial" w:cs="Arial"/>
-                <w:kern w:val="0"/>
-                <w:sz w:val="20"/>
-                <w:szCs w:val="20"/>
-              </w:rPr>
-              <w:t xml:space="preserve">14:00-15:00</w:t>
-            </w:r>
-          </w:p>
-          <w:p>
-            <w:pPr>
-              <w:widowControl/>
-              <w:snapToGrid w:val="0"/>
-              <w:spacing w:line="276" w:lineRule="auto"/>
-              <w:jc w:val="left"/>
-              <w:rPr>
-                <w:rFonts w:ascii="Arial" w:eastAsia="KaiTi" w:hAnsi="Arial" w:cs="Arial"/>
-                <w:bCs/>
-                <w:kern w:val="0"/>
-                <w:sz w:val="20"/>
-                <w:szCs w:val="20"/>
-              </w:rPr>
-            </w:pPr>
-            <w:r>
-              <w:rPr>
-                <w:rFonts w:ascii="Arial" w:eastAsia="KaiTi" w:hAnsi="Arial" w:cs="Arial"/>
-                <w:bCs/>
-                <w:kern w:val="0"/>
-                <w:sz w:val="20"/>
-                <w:szCs w:val="20"/>
-              </w:rPr>
-              <w:t xml:space="preserve">本地时间</w:t>
-            </w:r>
-          </w:p>
-          <w:p>
-            <w:pPr>
-              <w:widowControl/>
-              <w:snapToGrid w:val="0"/>
-              <w:spacing w:line="276" w:lineRule="auto"/>
-              <w:jc w:val="left"/>
-              <w:rPr>
-                <w:rFonts w:ascii="Arial" w:eastAsia="KaiTi" w:hAnsi="Arial" w:cs="Arial"/>
-                <w:bCs/>
-                <w:kern w:val="0"/>
-                <w:sz w:val="20"/>
-                <w:szCs w:val="20"/>
-              </w:rPr>
-            </w:pPr>
-          </w:p>
-          <w:p>
-            <w:pPr>
-              <w:widowControl/>
-              <w:jc w:val="left"/>
-              <w:rPr>
-                <w:rFonts w:ascii="Arial" w:eastAsia="KaiTi" w:hAnsi="Arial" w:cs="Arial"/>
-                <w:kern w:val="0"/>
-                <w:sz w:val="20"/>
-                <w:szCs w:val="20"/>
-              </w:rPr>
-            </w:pPr>
-            <w:proofErr w:type="gramStart"/>
-            <w:r>
-              <w:rPr>
-                <w:rFonts w:ascii="Arial" w:eastAsia="KaiTi" w:hAnsi="Arial" w:cs="Arial"/>
-                <w:kern w:val="0"/>
-                <w:sz w:val="20"/>
-                <w:szCs w:val="20"/>
-              </w:rPr>
-              <w:t xml:space="preserve">小组会</w:t>
-            </w:r>
-          </w:p>
-          <w:p>
-            <w:pPr>
-              <w:widowControl/>
-              <w:snapToGrid w:val="0"/>
-              <w:spacing w:line="276" w:lineRule="auto"/>
-              <w:jc w:val="left"/>
-              <w:rPr>
-                <w:rFonts w:ascii="Arial" w:eastAsia="KaiTi" w:hAnsi="Arial" w:cs="Arial"/>
-                <w:b/>
-                <w:kern w:val="0"/>
-                <w:sz w:val="20"/>
-                <w:szCs w:val="20"/>
-              </w:rPr>
-            </w:pPr>
-          </w:p>
-          <w:p>
-            <w:pPr>
-              <w:widowControl/>
-              <w:snapToGrid w:val="0"/>
-              <w:spacing w:line="276" w:lineRule="auto"/>
-              <w:jc w:val="left"/>
-              <w:rPr>
-                <w:rFonts w:ascii="Arial" w:eastAsia="KaiTi" w:hAnsi="Arial" w:cs="Arial"/>
-                <w:b/>
-                <w:kern w:val="0"/>
-                <w:sz w:val="20"/>
-                <w:szCs w:val="20"/>
-              </w:rPr>
-            </w:pPr>
-            <w:proofErr w:type="gramStart"/>
-            <w:r>
-              <w:rPr>
-                <w:rFonts w:ascii="Arial" w:eastAsia="KaiTi" w:hAnsi="Arial" w:cs="Arial"/>
-                <w:kern w:val="0"/>
-                <w:sz w:val="20"/>
-                <w:szCs w:val="20"/>
-              </w:rPr>
-              <w:t xml:space="preserve">中文</w:t>
-            </w:r>
-          </w:p>
-        </w:tc>
-        <w:tc>
-          <w:tcPr>
-            <w:tcW w:w="8585" w:type="dxa"/>
-            <w:tcBorders>
-              <w:top w:val="single" w:sz="4" w:space="0" w:color="auto"/>
-              <w:left w:val="nil"/>
-              <w:bottom w:val="single" w:sz="4" w:space="0" w:color="auto"/>
-              <w:right w:val="nil"/>
-            </w:tcBorders>
-          </w:tcPr>
-          <w:p>
-            <w:pPr>
-              <w:widowControl/>
-              <w:numPr>
-                <w:ilvl w:val="0"/>
-                <w:numId w:val="1"/>
-              </w:numPr>
-              <w:snapToGrid w:val="0"/>
-              <w:spacing w:before="60" w:after="60"/>
-              <w:ind w:right="144"/>
-              <w:jc w:val="left"/>
-              <w:rPr>
-                <w:rFonts w:ascii="Arial" w:eastAsia="KaiTi" w:hAnsi="Arial" w:cs="Arial"/>
-                <w:b/>
-                <w:kern w:val="0"/>
-                <w:sz w:val="20"/>
-                <w:szCs w:val="20"/>
-              </w:rPr>
-            </w:pPr>
-            <w:r>
-              <w:rPr>
-                <w:rFonts w:ascii="Arial" w:eastAsia="KaiTi" w:hAnsi="Arial" w:cs="Arial"/>
-                <w:b/>
-                <w:kern w:val="0"/>
-                <w:sz w:val="20"/>
-                <w:szCs w:val="20"/>
-              </w:rPr>
-              <w:t xml:space="preserve">投资者类型：</w:t>
-            </w:r>
-            <w:r>
-              <w:rPr>
-                <w:rFonts w:ascii="Arial" w:eastAsia="KaiTi" w:hAnsi="Arial" w:cs="Arial"/>
-                <w:kern w:val="0"/>
-                <w:sz w:val="20"/>
-                <w:szCs w:val="20"/>
-              </w:rPr>
-              <w:t xml:space="preserve">国际长线</w:t>
-            </w:r>
-          </w:p>
-          <w:p>
-            <w:pPr>
-              <w:widowControl/>
-              <w:numPr>
-                <w:ilvl w:val="0"/>
-                <w:numId w:val="1"/>
-              </w:numPr>
-              <w:snapToGrid w:val="0"/>
-              <w:spacing w:before="60" w:after="60"/>
-              <w:ind w:right="144"/>
-              <w:jc w:val="left"/>
-              <w:rPr>
-                <w:rFonts w:ascii="Arial" w:eastAsia="KaiTi" w:hAnsi="Arial" w:cs="Arial"/>
-                <w:b/>
-                <w:kern w:val="0"/>
-                <w:sz w:val="20"/>
-                <w:szCs w:val="20"/>
-              </w:rPr>
-            </w:pPr>
-            <w:r>
-              <w:rPr>
-                <w:rFonts w:ascii="Arial" w:eastAsia="KaiTi" w:hAnsi="Arial" w:cs="Arial"/>
-                <w:b/>
-                <w:kern w:val="0"/>
-                <w:sz w:val="20"/>
-                <w:szCs w:val="20"/>
-              </w:rPr>
-              <w:t xml:space="preserve">资产管理规模：</w:t>
-            </w:r>
-            <w:r>
-              <w:rPr>
-                <w:rFonts w:ascii="Arial" w:eastAsia="KaiTi" w:hAnsi="Arial" w:cs="Arial"/>
-                <w:kern w:val="0"/>
-                <w:sz w:val="20"/>
-                <w:szCs w:val="20"/>
-              </w:rPr>
-              <w:t xml:space="preserve">3万亿美元</w:t>
-            </w:r>
-          </w:p>
-          <w:p>
-            <w:pPr>
-              <w:widowControl/>
-              <w:numPr>
-                <w:ilvl w:val="0"/>
-                <w:numId w:val="1"/>
-              </w:numPr>
-              <w:snapToGrid w:val="0"/>
-              <w:spacing w:before="60" w:after="60"/>
-              <w:ind w:right="144"/>
-              <w:jc w:val="left"/>
-              <w:rPr>
-                <w:rFonts w:ascii="Arial" w:eastAsia="KaiTi" w:hAnsi="Arial" w:cs="Arial"/>
-                <w:b/>
-                <w:kern w:val="0"/>
-                <w:sz w:val="20"/>
-                <w:szCs w:val="20"/>
-              </w:rPr>
-            </w:pPr>
-            <w:r>
-              <w:rPr>
-                <w:rFonts w:ascii="Arial" w:eastAsia="KaiTi" w:hAnsi="Arial" w:cs="Arial"/>
-                <w:b/>
-                <w:kern w:val="0"/>
-                <w:sz w:val="20"/>
-                <w:szCs w:val="20"/>
-              </w:rPr>
-              <w:t xml:space="preserve">参会人：</w:t>
-            </w:r>
-            <w:r>
-              <w:rPr>
-                <w:rFonts w:ascii="Arial" w:eastAsia="KaiTi" w:hAnsi="Arial" w:cs="Arial"/>
-                <w:kern w:val="0"/>
-                <w:sz w:val="20"/>
-                <w:szCs w:val="20"/>
-              </w:rPr>
-              <w:t xml:space="preserve">Luka Zhu（资深研究员）</w:t>
-              <w:br/>
-              <w:t xml:space="preserve"/>
-              <w:br/>
-              <w:t xml:space="preserve">远景动力：</w:t>
-              <w:br/>
-              <w:t xml:space="preserve">Howard Wang（大中华区投资总监）</w:t>
-              <w:br/>
-              <w:t xml:space="preserve">Mark Mao（执行总经理）</w:t>
-              <w:br/>
-              <w:t xml:space="preserve">Penny Tu（基金经理）</w:t>
-              <w:br/>
-              <w:t xml:space="preserve">Julie Ho（基金经理）"</w:t>
-            </w:r>
-          </w:p>
-          <w:p>
-            <w:pPr>
-              <w:widowControl/>
-              <w:numPr>
-                <w:ilvl w:val="0"/>
-                <w:numId w:val="1"/>
-              </w:numPr>
-              <w:snapToGrid w:val="0"/>
-              <w:spacing w:before="60" w:after="60"/>
-              <w:ind w:right="144"/>
-              <w:jc w:val="left"/>
-              <w:rPr>
-                <w:rFonts w:ascii="Arial" w:eastAsia="KaiTi" w:hAnsi="Arial" w:cs="Arial"/>
-                <w:b/>
-                <w:kern w:val="0"/>
-                <w:sz w:val="20"/>
-                <w:szCs w:val="20"/>
-              </w:rPr>
-            </w:pPr>
-            <w:r>
-              <w:rPr>
-                <w:rFonts w:ascii="Arial" w:eastAsia="KaiTi" w:hAnsi="Arial" w:cs="Arial"/>
-                <w:b/>
-                <w:kern w:val="0"/>
-                <w:sz w:val="20"/>
-                <w:szCs w:val="20"/>
-              </w:rPr>
-              <w:t>负责投行：</w:t>
-            </w:r>
-            <w:r>
-              <w:rPr>
-                <w:rFonts w:ascii="KaiTi" w:eastAsia="KaiTi" w:hAnsi="KaiTi"/>
-                <w:sz w:val="20"/>
-                <w:szCs w:val="20"/>
-              </w:rPr>
-              <w:t>招证国际</w:t>
-            </w:r>
-          </w:p>
-          <w:p>
-            <w:pPr>
-              <w:widowControl/>
-              <w:numPr>
-                <w:ilvl w:val="0"/>
-                <w:numId w:val="1"/>
-              </w:numPr>
-              <w:snapToGrid w:val="0"/>
-              <w:spacing w:before="60" w:after="60"/>
-              <w:ind w:right="144"/>
-              <w:jc w:val="left"/>
-              <w:rPr>
-                <w:rFonts w:ascii="Arial" w:eastAsia="KaiTi" w:hAnsi="Arial" w:cs="Arial"/>
-                <w:b/>
-                <w:kern w:val="0"/>
-                <w:sz w:val="20"/>
-                <w:szCs w:val="20"/>
-              </w:rPr>
-            </w:pPr>
-            <w:r>
-              <w:rPr>
-                <w:rFonts w:ascii="Arial" w:eastAsia="KaiTi" w:hAnsi="Arial" w:cs="Arial"/>
-                <w:b/>
-                <w:kern w:val="0"/>
-                <w:sz w:val="20"/>
-                <w:szCs w:val="20"/>
-              </w:rPr>
-              <w:t xml:space="preserve">投资者简介：</w:t>
-            </w:r>
-          </w:p>
-          <w:p>
-            <w:pPr>
-              <w:pStyle w:val="ListParagraph"/>
-              <w:widowControl/>
-              <w:numPr>
-                <w:ilvl w:val="0"/>
-                <w:numId w:val="4"/>
-              </w:numPr>
-              <w:snapToGrid w:val="0"/>
-              <w:spacing w:before="60" w:after="60"/>
-              <w:ind w:right="144"/>
-              <w:jc w:val="left"/>
-              <w:rPr>
-                <w:rFonts w:ascii="Arial" w:eastAsia="KaiTi" w:hAnsi="Arial" w:cs="Arial"/>
-                <w:b/>
-                <w:kern w:val="0"/>
-                <w:sz w:val="20"/>
-                <w:szCs w:val="20"/>
-              </w:rPr>
-            </w:pPr>
-            <w:proofErr w:type="gramStart"/>
-            <w:r>
-              <w:rPr>
-                <w:rFonts w:ascii="Arial" w:eastAsia="KaiTi" w:hAnsi="Arial" w:cs="Arial"/>
-                <w:kern w:val="0"/>
-                <w:sz w:val="20"/>
-                <w:szCs w:val="20"/>
-              </w:rPr>
-              <w:t xml:space="preserve">JP摩根资产管理（J.P. Morgan Asset Management）隶属于摩根大通集团，是全球领先的综合性资产管理机构之一，为机构投资者、零售客户及高净值客户提供多元化投资解决方案。公司业务覆盖全球主要市场，投资范围涵盖股票、固定收益、多资产、房地产、对冲基金、私募股权及流动性管理等主要资产类别。截至2025年中，摩根资产管理全球管理规模约为3.9万亿美元，在全球资产管理行业中位居前列</w:t>
-            </w:r>
-            <w:r>
-              <w:rPr>
-                <w:rFonts w:ascii="Arial" w:eastAsia="KaiTi" w:hAnsi="Arial" w:cs="Arial"/>
-                <w:kern w:val="0"/>
-                <w:sz w:val="20"/>
-                <w:szCs w:val="20"/>
-              </w:rPr>
-              <w:t xml:space="preserve"/>
-            </w:r>
-          </w:p>
-          <w:p>
-            <w:pPr>
-              <w:pStyle w:val="ListParagraph"/>
-              <w:widowControl/>
-              <w:numPr>
-                <w:ilvl w:val="0"/>
-                <w:numId w:val="4"/>
-              </w:numPr>
-              <w:snapToGrid w:val="0"/>
-              <w:spacing w:before="60" w:after="60"/>
-              <w:ind w:right="144"/>
-              <w:jc w:val="left"/>
-              <w:rPr>
-                <w:rFonts w:ascii="Arial" w:eastAsia="KaiTi" w:hAnsi="Arial" w:cs="Arial"/>
-                <w:b/>
-                <w:kern w:val="0"/>
-                <w:sz w:val="20"/>
-                <w:szCs w:val="20"/>
-              </w:rPr>
-            </w:pPr>
-            <w:r>
-              <w:rPr>
-                <w:rFonts w:ascii="Arial" w:eastAsia="KaiTi" w:hAnsi="Arial" w:cs="Arial"/>
-                <w:kern w:val="0"/>
-                <w:sz w:val="20"/>
-                <w:szCs w:val="20"/>
-              </w:rPr>
-              <w:t xml:space="preserve">过往港股基石投资案例：</w:t>
-            </w:r>
-            <w:r>
-              <w:rPr>
-                <w:rFonts w:ascii="Arial" w:eastAsia="KaiTi" w:hAnsi="Arial" w:cs="Arial"/>
-                <w:kern w:val="0"/>
-                <w:sz w:val="20"/>
-                <w:szCs w:val="20"/>
-              </w:rPr>
-              <w:t xml:space="preserve">华勤技术、东鹏饮料</w:t>
-            </w:r>
-            <w:r>
-              <w:rPr>
-                <w:rFonts w:ascii="Arial" w:eastAsia="KaiTi" w:hAnsi="Arial" w:cs="Arial"/>
-                <w:kern w:val="0"/>
-                <w:sz w:val="20"/>
-                <w:szCs w:val="20"/>
-              </w:rPr>
-              <w:t>等</w:t>
-            </w:r>
-            <w:r>
-              <w:rPr>
-                <w:rFonts w:ascii="Arial" w:eastAsia="KaiTi" w:hAnsi="Arial" w:cs="Arial"/>
-                <w:kern w:val="0"/>
-                <w:sz w:val="20"/>
-                <w:szCs w:val="20"/>
-              </w:rPr>
-              <w:t xml:space="preserve"/>
-            </w:r>
-          </w:p>
-        </w:tc>
-      </w:tr>
-      <w:tr>
-        <w:trPr>
-          <w:jc w:val="center"/>
-        </w:trPr>
-        <w:tc>
-          <w:tcPr>
-            <w:tcW w:w="2327" w:type="dxa"/>
-            <w:tcBorders>
-              <w:top w:val="single" w:sz="4" w:space="0" w:color="auto"/>
-              <w:left w:val="nil"/>
-              <w:bottom w:val="single" w:sz="4" w:space="0" w:color="auto"/>
-              <w:right w:val="nil"/>
-            </w:tcBorders>
-          </w:tcPr>
-          <w:p>
-            <w:pPr>
-              <w:widowControl/>
-              <w:jc w:val="left"/>
-              <w:rPr>
-                <w:rFonts w:ascii="Arial" w:eastAsia="KaiTi" w:hAnsi="Arial" w:cs="Arial"/>
-                <w:sz w:val="20"/>
-                <w:szCs w:val="20"/>
-              </w:rPr>
-            </w:pPr>
-            <w:r>
-              <w:rPr>
-                <w:rFonts w:ascii="Arial" w:eastAsia="KaiTi" w:hAnsi="Arial" w:cs="Arial"/>
-                <w:sz w:val="20"/>
-                <w:szCs w:val="20"/>
-              </w:rPr>
-              <w:t xml:space="preserve"/>
-            </w:r>
-            <w:r>
-              <w:rPr>
-                <w:rFonts w:ascii="Arial" w:eastAsia="KaiTi" w:hAnsi="Arial" w:cs="Arial"/>
-                <w:b/>
-                <w:color w:val="000000"/>
-                <w:kern w:val="0"/>
-                <w:sz w:val="20"/>
-                <w:szCs w:val="20"/>
-              </w:rPr>
-              <w:t xml:space="preserve">Longrising AM</w:t>
-              <w:br/>
-              <w:t xml:space="preserve">源乐晟</w:t>
-            </w:r>
-          </w:p>
-          <w:p>
-            <w:pPr>
-              <w:widowControl/>
-              <w:snapToGrid w:val="0"/>
-              <w:spacing w:line="276" w:lineRule="auto"/>
-              <w:jc w:val="left"/>
-              <w:rPr>
-                <w:rFonts w:ascii="Arial" w:eastAsia="KaiTi" w:hAnsi="Arial" w:cs="Arial"/>
-                <w:b/>
-                <w:bCs/>
-                <w:kern w:val="0"/>
-                <w:sz w:val="20"/>
-                <w:szCs w:val="20"/>
-              </w:rPr>
-            </w:pPr>
-          </w:p>
-          <w:p>
-            <w:pPr>
-              <w:widowControl/>
-              <w:snapToGrid w:val="0"/>
-              <w:spacing w:line="276" w:lineRule="auto"/>
-              <w:jc w:val="left"/>
-              <w:rPr>
-                <w:rFonts w:ascii="Arial" w:eastAsia="KaiTi" w:hAnsi="Arial" w:cs="Arial"/>
-                <w:b/>
-                <w:kern w:val="0"/>
-                <w:sz w:val="20"/>
-                <w:szCs w:val="20"/>
-              </w:rPr>
-            </w:pPr>
-            <w:r>
-              <w:rPr>
-                <w:rFonts w:ascii="Arial" w:eastAsia="KaiTi" w:hAnsi="Arial" w:cs="Arial"/>
-                <w:b/>
-                <w:kern w:val="0"/>
-                <w:sz w:val="20"/>
-                <w:szCs w:val="20"/>
-              </w:rPr>
-              <w:t>会议时间</w:t>
-            </w:r>
-            <w:r>
-              <w:rPr>
-                <w:rFonts w:ascii="Arial" w:eastAsia="KaiTi" w:hAnsi="Arial" w:cs="Arial"/>
-                <w:b/>
-                <w:kern w:val="0"/>
-                <w:sz w:val="20"/>
-                <w:szCs w:val="20"/>
-              </w:rPr>
-              <w:t xml:space="preserve">:</w:t>
-            </w:r>
-          </w:p>
-          <w:p>
-            <w:pPr>
-              <w:widowControl/>
-              <w:snapToGrid w:val="0"/>
-              <w:spacing w:line="276" w:lineRule="auto"/>
-              <w:jc w:val="left"/>
-              <w:rPr>
-                <w:rFonts w:ascii="Arial" w:eastAsia="KaiTi" w:hAnsi="Arial" w:cs="Arial"/>
-                <w:kern w:val="0"/>
-                <w:sz w:val="20"/>
-                <w:szCs w:val="20"/>
-              </w:rPr>
-            </w:pPr>
-            <w:proofErr w:type="gramStart"/>
-            <w:r>
-              <w:rPr>
-                <w:rFonts w:ascii="Arial" w:eastAsia="KaiTi" w:hAnsi="Arial" w:cs="Arial"/>
-                <w:kern w:val="0"/>
-                <w:sz w:val="20"/>
-                <w:szCs w:val="20"/>
-              </w:rPr>
-              <w:t xml:space="preserve">14:00-15:00</w:t>
-            </w:r>
-          </w:p>
-          <w:p>
-            <w:pPr>
-              <w:widowControl/>
-              <w:snapToGrid w:val="0"/>
-              <w:spacing w:line="276" w:lineRule="auto"/>
-              <w:jc w:val="left"/>
-              <w:rPr>
-                <w:rFonts w:ascii="Arial" w:eastAsia="KaiTi" w:hAnsi="Arial" w:cs="Arial"/>
-                <w:bCs/>
-                <w:kern w:val="0"/>
-                <w:sz w:val="20"/>
-                <w:szCs w:val="20"/>
-              </w:rPr>
-            </w:pPr>
-            <w:r>
-              <w:rPr>
-                <w:rFonts w:ascii="Arial" w:eastAsia="KaiTi" w:hAnsi="Arial" w:cs="Arial"/>
-                <w:bCs/>
-                <w:kern w:val="0"/>
-                <w:sz w:val="20"/>
-                <w:szCs w:val="20"/>
-              </w:rPr>
-              <w:t xml:space="preserve">本地时间</w:t>
-            </w:r>
-          </w:p>
-          <w:p>
-            <w:pPr>
-              <w:widowControl/>
-              <w:snapToGrid w:val="0"/>
-              <w:spacing w:line="276" w:lineRule="auto"/>
-              <w:jc w:val="left"/>
-              <w:rPr>
-                <w:rFonts w:ascii="Arial" w:eastAsia="KaiTi" w:hAnsi="Arial" w:cs="Arial"/>
-                <w:bCs/>
-                <w:kern w:val="0"/>
-                <w:sz w:val="20"/>
-                <w:szCs w:val="20"/>
-              </w:rPr>
-            </w:pPr>
-          </w:p>
-          <w:p>
-            <w:pPr>
-              <w:widowControl/>
-              <w:jc w:val="left"/>
-              <w:rPr>
-                <w:rFonts w:ascii="Arial" w:eastAsia="KaiTi" w:hAnsi="Arial" w:cs="Arial"/>
-                <w:kern w:val="0"/>
-                <w:sz w:val="20"/>
-                <w:szCs w:val="20"/>
-              </w:rPr>
-            </w:pPr>
-            <w:proofErr w:type="gramStart"/>
-            <w:r>
-              <w:rPr>
-                <w:rFonts w:ascii="Arial" w:eastAsia="KaiTi" w:hAnsi="Arial" w:cs="Arial"/>
-                <w:kern w:val="0"/>
-                <w:sz w:val="20"/>
-                <w:szCs w:val="20"/>
-              </w:rPr>
-              <w:t xml:space="preserve">小组会</w:t>
-            </w:r>
-          </w:p>
-          <w:p>
-            <w:pPr>
-              <w:widowControl/>
-              <w:snapToGrid w:val="0"/>
-              <w:spacing w:line="276" w:lineRule="auto"/>
-              <w:jc w:val="left"/>
-              <w:rPr>
-                <w:rFonts w:ascii="Arial" w:eastAsia="KaiTi" w:hAnsi="Arial" w:cs="Arial"/>
-                <w:b/>
-                <w:kern w:val="0"/>
-                <w:sz w:val="20"/>
-                <w:szCs w:val="20"/>
-              </w:rPr>
-            </w:pPr>
-          </w:p>
-          <w:p>
-            <w:pPr>
-              <w:widowControl/>
-              <w:snapToGrid w:val="0"/>
-              <w:spacing w:line="276" w:lineRule="auto"/>
-              <w:jc w:val="left"/>
-              <w:rPr>
-                <w:rFonts w:ascii="Arial" w:eastAsia="KaiTi" w:hAnsi="Arial" w:cs="Arial"/>
-                <w:b/>
-                <w:kern w:val="0"/>
-                <w:sz w:val="20"/>
-                <w:szCs w:val="20"/>
-              </w:rPr>
-            </w:pPr>
-            <w:proofErr w:type="gramStart"/>
-            <w:r>
-              <w:rPr>
-                <w:rFonts w:ascii="Arial" w:eastAsia="KaiTi" w:hAnsi="Arial" w:cs="Arial"/>
-                <w:kern w:val="0"/>
-                <w:sz w:val="20"/>
-                <w:szCs w:val="20"/>
-              </w:rPr>
-              <w:t xml:space="preserve">中文</w:t>
-            </w:r>
-          </w:p>
-        </w:tc>
-        <w:tc>
-          <w:tcPr>
-            <w:tcW w:w="8585" w:type="dxa"/>
-            <w:tcBorders>
-              <w:top w:val="single" w:sz="4" w:space="0" w:color="auto"/>
-              <w:left w:val="nil"/>
-              <w:bottom w:val="single" w:sz="4" w:space="0" w:color="auto"/>
-              <w:right w:val="nil"/>
-            </w:tcBorders>
-          </w:tcPr>
-          <w:p>
-            <w:pPr>
-              <w:widowControl/>
-              <w:numPr>
-                <w:ilvl w:val="0"/>
-                <w:numId w:val="1"/>
-              </w:numPr>
-              <w:snapToGrid w:val="0"/>
-              <w:spacing w:before="60" w:after="60"/>
-              <w:ind w:right="144"/>
-              <w:jc w:val="left"/>
-              <w:rPr>
-                <w:rFonts w:ascii="Arial" w:eastAsia="KaiTi" w:hAnsi="Arial" w:cs="Arial"/>
-                <w:b/>
-                <w:kern w:val="0"/>
-                <w:sz w:val="20"/>
-                <w:szCs w:val="20"/>
-              </w:rPr>
-            </w:pPr>
-            <w:r>
-              <w:rPr>
-                <w:rFonts w:ascii="Arial" w:eastAsia="KaiTi" w:hAnsi="Arial" w:cs="Arial"/>
-                <w:b/>
-                <w:kern w:val="0"/>
-                <w:sz w:val="20"/>
-                <w:szCs w:val="20"/>
-              </w:rPr>
-              <w:t xml:space="preserve">投资者类型：</w:t>
-            </w:r>
-            <w:r>
-              <w:rPr>
-                <w:rFonts w:ascii="Arial" w:eastAsia="KaiTi" w:hAnsi="Arial" w:cs="Arial"/>
-                <w:kern w:val="0"/>
-                <w:sz w:val="20"/>
-                <w:szCs w:val="20"/>
-              </w:rPr>
-              <w:t xml:space="preserve">中资长线</w:t>
-            </w:r>
-          </w:p>
-          <w:p>
-            <w:pPr>
-              <w:widowControl/>
-              <w:numPr>
-                <w:ilvl w:val="0"/>
-                <w:numId w:val="1"/>
-              </w:numPr>
-              <w:snapToGrid w:val="0"/>
-              <w:spacing w:before="60" w:after="60"/>
-              <w:ind w:right="144"/>
-              <w:jc w:val="left"/>
-              <w:rPr>
-                <w:rFonts w:ascii="Arial" w:eastAsia="KaiTi" w:hAnsi="Arial" w:cs="Arial"/>
-                <w:b/>
-                <w:kern w:val="0"/>
-                <w:sz w:val="20"/>
-                <w:szCs w:val="20"/>
-              </w:rPr>
-            </w:pPr>
-            <w:r>
-              <w:rPr>
-                <w:rFonts w:ascii="Arial" w:eastAsia="KaiTi" w:hAnsi="Arial" w:cs="Arial"/>
-                <w:b/>
-                <w:kern w:val="0"/>
-                <w:sz w:val="20"/>
-                <w:szCs w:val="20"/>
-              </w:rPr>
-              <w:t xml:space="preserve">资产管理规模：</w:t>
-            </w:r>
-            <w:r>
-              <w:rPr>
-                <w:rFonts w:ascii="Arial" w:eastAsia="KaiTi" w:hAnsi="Arial" w:cs="Arial"/>
-                <w:kern w:val="0"/>
-                <w:sz w:val="20"/>
-                <w:szCs w:val="20"/>
-              </w:rPr>
-              <w:t xml:space="preserve">超400亿人民币</w:t>
-            </w:r>
-          </w:p>
-          <w:p>
-            <w:pPr>
-              <w:widowControl/>
-              <w:numPr>
-                <w:ilvl w:val="0"/>
-                <w:numId w:val="1"/>
-              </w:numPr>
-              <w:snapToGrid w:val="0"/>
-              <w:spacing w:before="60" w:after="60"/>
-              <w:ind w:right="144"/>
-              <w:jc w:val="left"/>
-              <w:rPr>
-                <w:rFonts w:ascii="Arial" w:eastAsia="KaiTi" w:hAnsi="Arial" w:cs="Arial"/>
-                <w:b/>
-                <w:kern w:val="0"/>
-                <w:sz w:val="20"/>
-                <w:szCs w:val="20"/>
-              </w:rPr>
-            </w:pPr>
-            <w:r>
-              <w:rPr>
-                <w:rFonts w:ascii="Arial" w:eastAsia="KaiTi" w:hAnsi="Arial" w:cs="Arial"/>
-                <w:b/>
-                <w:kern w:val="0"/>
-                <w:sz w:val="20"/>
-                <w:szCs w:val="20"/>
-              </w:rPr>
-              <w:t xml:space="preserve">参会人：</w:t>
-            </w:r>
-            <w:r>
-              <w:rPr>
-                <w:rFonts w:ascii="Arial" w:eastAsia="KaiTi" w:hAnsi="Arial" w:cs="Arial"/>
-                <w:kern w:val="0"/>
-                <w:sz w:val="20"/>
-                <w:szCs w:val="20"/>
-              </w:rPr>
-              <w:t xml:space="preserve">杨建海（基金经理）</w:t>
-            </w:r>
-          </w:p>
-          <w:p>
-            <w:pPr>
-              <w:widowControl/>
-              <w:numPr>
-                <w:ilvl w:val="0"/>
-                <w:numId w:val="1"/>
-              </w:numPr>
-              <w:snapToGrid w:val="0"/>
-              <w:spacing w:before="60" w:after="60"/>
-              <w:ind w:right="144"/>
-              <w:jc w:val="left"/>
-              <w:rPr>
-                <w:rFonts w:ascii="Arial" w:eastAsia="KaiTi" w:hAnsi="Arial" w:cs="Arial"/>
-                <w:b/>
-                <w:kern w:val="0"/>
-                <w:sz w:val="20"/>
-                <w:szCs w:val="20"/>
-              </w:rPr>
-            </w:pPr>
-            <w:r>
-              <w:rPr>
-                <w:rFonts w:ascii="Arial" w:eastAsia="KaiTi" w:hAnsi="Arial" w:cs="Arial"/>
-                <w:b/>
-                <w:kern w:val="0"/>
-                <w:sz w:val="20"/>
-                <w:szCs w:val="20"/>
-              </w:rPr>
-              <w:t>负责投行：</w:t>
-            </w:r>
-            <w:r>
-              <w:rPr>
-                <w:rFonts w:ascii="KaiTi" w:eastAsia="KaiTi" w:hAnsi="KaiTi"/>
-                <w:sz w:val="20"/>
-                <w:szCs w:val="20"/>
-              </w:rPr>
-              <w:t>招证国际</w:t>
-            </w:r>
-          </w:p>
-          <w:p>
-            <w:pPr>
-              <w:widowControl/>
-              <w:numPr>
-                <w:ilvl w:val="0"/>
-                <w:numId w:val="1"/>
-              </w:numPr>
-              <w:snapToGrid w:val="0"/>
-              <w:spacing w:before="60" w:after="60"/>
-              <w:ind w:right="144"/>
-              <w:jc w:val="left"/>
-              <w:rPr>
-                <w:rFonts w:ascii="Arial" w:eastAsia="KaiTi" w:hAnsi="Arial" w:cs="Arial"/>
-                <w:b/>
-                <w:kern w:val="0"/>
-                <w:sz w:val="20"/>
-                <w:szCs w:val="20"/>
-              </w:rPr>
-            </w:pPr>
-            <w:r>
-              <w:rPr>
-                <w:rFonts w:ascii="Arial" w:eastAsia="KaiTi" w:hAnsi="Arial" w:cs="Arial"/>
-                <w:b/>
-                <w:kern w:val="0"/>
-                <w:sz w:val="20"/>
-                <w:szCs w:val="20"/>
-              </w:rPr>
-              <w:t xml:space="preserve">投资者简介：</w:t>
-            </w:r>
-          </w:p>
-          <w:p>
-            <w:pPr>
-              <w:pStyle w:val="ListParagraph"/>
-              <w:widowControl/>
-              <w:numPr>
-                <w:ilvl w:val="0"/>
-                <w:numId w:val="4"/>
-              </w:numPr>
-              <w:snapToGrid w:val="0"/>
-              <w:spacing w:before="60" w:after="60"/>
-              <w:ind w:right="144"/>
-              <w:jc w:val="left"/>
-              <w:rPr>
-                <w:rFonts w:ascii="Arial" w:eastAsia="KaiTi" w:hAnsi="Arial" w:cs="Arial"/>
-                <w:b/>
-                <w:kern w:val="0"/>
-                <w:sz w:val="20"/>
-                <w:szCs w:val="20"/>
-              </w:rPr>
-            </w:pPr>
-            <w:proofErr w:type="gramStart"/>
-            <w:r>
-              <w:rPr>
-                <w:rFonts w:ascii="Arial" w:eastAsia="KaiTi" w:hAnsi="Arial" w:cs="Arial"/>
-                <w:kern w:val="0"/>
-                <w:sz w:val="20"/>
-                <w:szCs w:val="20"/>
-              </w:rPr>
-              <w:t xml:space="preserve">源乐晟资产管理有限公司（Longrising Asset Management）成立于2008年3月，是国内知名的私募证券投资基金管理人，旗下设有北京源乐晟资产与西藏源乐晟资产两个平行平台。公司在投资管理上遵循“相信价值、尊重市场、寻找GARP、理解盈亏同源”的投资理念，致力于挖掘景气周期中的优秀企业，为投资者提供可持续创造稳健收益的财富管理服务。</w:t>
-            </w:r>
-            <w:r>
-              <w:rPr>
-                <w:rFonts w:ascii="Arial" w:eastAsia="KaiTi" w:hAnsi="Arial" w:cs="Arial"/>
-                <w:kern w:val="0"/>
-                <w:sz w:val="20"/>
-                <w:szCs w:val="20"/>
-              </w:rPr>
-              <w:t xml:space="preserve"/>
-            </w:r>
-          </w:p>
-          <w:p>
-            <w:pPr>
-              <w:pStyle w:val="ListParagraph"/>
-              <w:widowControl/>
-              <w:numPr>
-                <w:ilvl w:val="0"/>
-                <w:numId w:val="4"/>
-              </w:numPr>
-              <w:snapToGrid w:val="0"/>
-              <w:spacing w:before="60" w:after="60"/>
-              <w:ind w:right="144"/>
-              <w:jc w:val="left"/>
-              <w:rPr>
-                <w:rFonts w:ascii="Arial" w:eastAsia="KaiTi" w:hAnsi="Arial" w:cs="Arial"/>
-                <w:b/>
-                <w:kern w:val="0"/>
-                <w:sz w:val="20"/>
-                <w:szCs w:val="20"/>
-              </w:rPr>
-            </w:pPr>
-            <w:r>
-              <w:rPr>
-                <w:rFonts w:ascii="Arial" w:eastAsia="KaiTi" w:hAnsi="Arial" w:cs="Arial"/>
-                <w:kern w:val="0"/>
-                <w:sz w:val="20"/>
-                <w:szCs w:val="20"/>
-              </w:rPr>
-              <w:t xml:space="preserve">过往港股基石投资案例：</w:t>
-            </w:r>
-            <w:r>
-              <w:rPr>
-                <w:rFonts w:ascii="Arial" w:eastAsia="KaiTi" w:hAnsi="Arial" w:cs="Arial"/>
-                <w:kern w:val="0"/>
-                <w:sz w:val="20"/>
-                <w:szCs w:val="20"/>
-              </w:rPr>
-              <w:t xml:space="preserve">奥克斯电气、大族数控、东软教育等</w:t>
-            </w:r>
-            <w:r>
-              <w:rPr>
-                <w:rFonts w:ascii="Arial" w:eastAsia="KaiTi" w:hAnsi="Arial" w:cs="Arial"/>
-                <w:kern w:val="0"/>
-                <w:sz w:val="20"/>
-                <w:szCs w:val="20"/>
-              </w:rPr>
-              <w:t>等</w:t>
-            </w:r>
-            <w:r>
-              <w:rPr>
-                <w:rFonts w:ascii="Arial" w:eastAsia="KaiTi" w:hAnsi="Arial" w:cs="Arial"/>
-                <w:kern w:val="0"/>
-                <w:sz w:val="20"/>
-                <w:szCs w:val="20"/>
-              </w:rPr>
-              <w:t xml:space="preserve"/>
-            </w:r>
-          </w:p>
-        </w:tc>
-      </w:tr>
-    </w:tbl>
-    <w:p>
-      <w:pPr>
-        <w:widowControl/>
-        <w:spacing w:after="200" w:line="276" w:lineRule="auto"/>
-        <w:jc w:val="center"/>
-        <w:rPr>
-          <w:rFonts w:ascii="Arial" w:eastAsia="KaiTi" w:hAnsi="Arial" w:cs="Arial"/>
-          <w:sz w:val="20"/>
-          <w:szCs w:val="20"/>
-        </w:rPr>
-      </w:pPr>
-      <w:r>
-        <w:rPr>
-          <w:rFonts w:ascii="Arial" w:eastAsia="KaiTi" w:hAnsi="Arial" w:cs="Arial"/>
-          <w:sz w:val="20"/>
-          <w:szCs w:val="20"/>
-        </w:rPr>
-        <w:br w:type="page"/>
-      </w:r>
-      <w:r>
-        <w:rPr>
-          <w:rFonts w:ascii="Arial" w:eastAsia="KaiTi" w:hAnsi="Arial" w:cs="Arial"/>
-          <w:sz w:val="20"/>
-          <w:szCs w:val="20"/>
-        </w:rPr>
-        <w:lastRenderedPageBreak/>
-        <w:t xml:space="preserve"/>
-      </w:r>
-      <w:r>
-        <w:rPr>
-          <w:rFonts w:ascii="Arial" w:eastAsia="KaiTi" w:hAnsi="Arial" w:cs="Arial"/>
-          <w:b/>
-          <w:color w:val="002060"/>
-          <w:kern w:val="0"/>
-          <w:sz w:val="28"/>
-          <w:szCs w:val="24"/>
-        </w:rPr>
-        <w:t xml:space="preserve">投资者简介</w:t>
-      </w:r>
-    </w:p>
-    <w:tbl>
-      <w:tblPr>
-        <w:tblW w:w="10912" w:type="dxa"/>
-        <w:jc w:val="center"/>
-        <w:tblLayout w:type="fixed"/>
-        <w:tblCellMar>
-          <w:top w:w="64" w:type="dxa"/>
-          <w:left w:w="128" w:type="dxa"/>
-          <w:bottom w:w="64" w:type="dxa"/>
-          <w:right w:w="128" w:type="dxa"/>
-        </w:tblCellMar>
-        <w:tblLook w:val="04A0" w:firstRow="1" w:lastRow="0" w:firstColumn="1" w:lastColumn="0" w:noHBand="0" w:noVBand="1"/>
-      </w:tblPr>
-      <w:tblGrid>
-        <w:gridCol w:w="2327"/>
-        <w:gridCol w:w="8585"/>
-      </w:tblGrid>
-      <w:tr>
-        <w:trPr>
-          <w:trHeight w:val="332"/>
-          <w:jc w:val="center"/>
-        </w:trPr>
-        <w:tc>
-          <w:tcPr>
-            <w:tcW w:w="10912" w:type="dxa"/>
-            <w:gridSpan w:val="2"/>
-            <w:shd w:val="clear" w:color="auto" w:fill="002060"/>
+            <w:shd w:val="clear" w:color="auto" w:fill="FF9300"/>
             <w:vAlign w:val="center"/>
           </w:tcPr>
           <w:p>

</xml_diff>